<commit_message>
improvise on Variant A w 3 different seeds (42,43,44)
</commit_message>
<xml_diff>
--- a/submission/final_paper.docx
+++ b/submission/final_paper.docx
@@ -2880,6 +2880,433 @@
           <w:sz w:val="20"/>
         </w:rPr>
         <w:t>), retaining fixed low-level retinal edge filters while fine-tuning higher-level semantic blocks.</w:t>
+      </w:r>
+    </w:p>
+    <w:p>
+      <w:pPr>
+        <w:keepNext/>
+        <w:spacing w:before="200" w:after="60"/>
+      </w:pPr>
+      <w:r>
+        <w:rPr>
+          <w:rFonts w:ascii="Times New Roman" w:hAnsi="Times New Roman"/>
+          <w:b/>
+          <w:i/>
+          <w:color w:val="283246"/>
+          <w:sz w:val="21"/>
+        </w:rPr>
+        <w:t>F. Optimizing Raw Classification Accuracy: Label Smoothing, Post-Hoc Logit Adjustment, and Multi-Seed Ensembling</w:t>
+      </w:r>
+    </w:p>
+    <w:p>
+      <w:pPr>
+        <w:keepNext/>
+        <w:spacing w:before="120" w:after="40"/>
+      </w:pPr>
+      <w:r>
+        <w:rPr>
+          <w:rFonts w:ascii="Times New Roman" w:hAnsi="Times New Roman"/>
+          <w:b/>
+          <w:color w:val="323232"/>
+          <w:sz w:val="20"/>
+        </w:rPr>
+        <w:t>1) The Dual Clinical Paradigm: Accuracy vs. Minority-Class Sensitivity</w:t>
+      </w:r>
+    </w:p>
+    <w:p>
+      <w:pPr>
+        <w:spacing w:before="0" w:after="90" w:line="276" w:lineRule="auto"/>
+        <w:jc w:val="both"/>
+      </w:pPr>
+      <w:r>
+        <w:rPr>
+          <w:rFonts w:ascii="Times New Roman" w:hAnsi="Times New Roman"/>
+          <w:b w:val="0"/>
+          <w:i w:val="0"/>
+          <w:color w:val="1E1E1E"/>
+          <w:sz w:val="20"/>
+        </w:rPr>
+        <w:t>While the primary objective of the CORN framework in Section IV.E was to maximize Quadratic Weighted Kappa (QWK) and elevate minority-class sensitivity on sight-threatening stages (Severe NPDR Recall $= 65.7\%$), clinical deployment often demands a dual perspective. In confirmatory tele-ophthalmology screening and automated primary grading, healthcare providers require high raw classification accuracy ($\ge 80\%$) and high specificity to avoid inundating secondary clinics with false alarms from the healthy majority cohort. Ordinal loss functions and class-balanced samplers inherently trade off majority-class accuracy for minority-class recall (yielding overall accuracy of $69.09\%$ in CORN and $59.64\%$ in CORAL, compared to $80.18\%$ in the baseline Softmax model).</w:t>
+      </w:r>
+    </w:p>
+    <w:p>
+      <w:pPr>
+        <w:spacing w:before="0" w:after="90" w:line="276" w:lineRule="auto"/>
+        <w:jc w:val="both"/>
+      </w:pPr>
+      <w:r>
+        <w:rPr>
+          <w:rFonts w:ascii="Times New Roman" w:hAnsi="Times New Roman"/>
+          <w:b w:val="0"/>
+          <w:i w:val="0"/>
+          <w:color w:val="1E1E1E"/>
+          <w:sz w:val="20"/>
+        </w:rPr>
+        <w:t>To investigate the theoretical ceiling of raw classification accuracy on the 5-class APTOS 2019 dataset without resorting to aggressive ordinal reweighting, we formulate an accuracy-centric optimization regime built on the uniform EfficientNet-B0 backbone.</w:t>
+      </w:r>
+    </w:p>
+    <w:p>
+      <w:pPr>
+        <w:keepNext/>
+        <w:spacing w:before="120" w:after="40"/>
+      </w:pPr>
+      <w:r>
+        <w:rPr>
+          <w:rFonts w:ascii="Times New Roman" w:hAnsi="Times New Roman"/>
+          <w:b/>
+          <w:color w:val="323232"/>
+          <w:sz w:val="20"/>
+        </w:rPr>
+        <w:t>2) Cross-Entropy with Label Smoothing</w:t>
+      </w:r>
+    </w:p>
+    <w:p>
+      <w:pPr>
+        <w:spacing w:before="0" w:after="90" w:line="276" w:lineRule="auto"/>
+        <w:jc w:val="both"/>
+      </w:pPr>
+      <w:r>
+        <w:rPr>
+          <w:rFonts w:ascii="Times New Roman" w:hAnsi="Times New Roman"/>
+          <w:b w:val="0"/>
+          <w:i w:val="0"/>
+          <w:color w:val="1E1E1E"/>
+          <w:sz w:val="20"/>
+        </w:rPr>
+        <w:t>Standard one-hot hard cross-entropy encourages overconfident output representations, driving output logits toward extreme values and causing the network to overfit to borderline ambiguous retinal fundus features. We replace standard cross-entropy with regularized label smoothing:</w:t>
+      </w:r>
+    </w:p>
+    <w:p>
+      <w:pPr>
+        <w:spacing w:before="0" w:after="90" w:line="276" w:lineRule="auto"/>
+        <w:jc w:val="both"/>
+      </w:pPr>
+      <w:r>
+        <w:rPr>
+          <w:rFonts w:ascii="Times New Roman" w:hAnsi="Times New Roman"/>
+          <w:b w:val="0"/>
+          <w:i w:val="0"/>
+          <w:color w:val="1E1E1E"/>
+          <w:sz w:val="20"/>
+        </w:rPr>
+        <w:t>$$y_{k}^{LS} = (1 - \alpha) y_k + \frac{\alpha}{K}$$</w:t>
+      </w:r>
+    </w:p>
+    <w:p>
+      <w:pPr>
+        <w:spacing w:before="0" w:after="90" w:line="276" w:lineRule="auto"/>
+        <w:jc w:val="both"/>
+      </w:pPr>
+      <w:r>
+        <w:rPr>
+          <w:rFonts w:ascii="Times New Roman" w:hAnsi="Times New Roman"/>
+          <w:b w:val="0"/>
+          <w:i w:val="0"/>
+          <w:color w:val="1E1E1E"/>
+          <w:sz w:val="20"/>
+        </w:rPr>
+        <w:t>where $\alpha = 0.08$ denotes the label smoothing parameter and $K=5$ is the number of clinical grades. Label smoothing prevents the model from assigning zero probability to plausible neighboring disease stages, calibrating softmax confidence and preventing margin overfitting on minority classes without artificially skewing class priors.</w:t>
+      </w:r>
+    </w:p>
+    <w:p>
+      <w:pPr>
+        <w:keepNext/>
+        <w:spacing w:before="120" w:after="40"/>
+      </w:pPr>
+      <w:r>
+        <w:rPr>
+          <w:rFonts w:ascii="Times New Roman" w:hAnsi="Times New Roman"/>
+          <w:b/>
+          <w:color w:val="323232"/>
+          <w:sz w:val="20"/>
+        </w:rPr>
+        <w:t>3) Safe Light Geometric and Photometric Augmentation</w:t>
+      </w:r>
+    </w:p>
+    <w:p>
+      <w:pPr>
+        <w:spacing w:before="0" w:after="90" w:line="276" w:lineRule="auto"/>
+        <w:jc w:val="both"/>
+      </w:pPr>
+      <w:r>
+        <w:rPr>
+          <w:rFonts w:ascii="Times New Roman" w:hAnsi="Times New Roman"/>
+          <w:b w:val="0"/>
+          <w:i w:val="0"/>
+          <w:color w:val="1E1E1E"/>
+          <w:sz w:val="20"/>
+        </w:rPr>
+        <w:t>Rather than applying synthetic oversampling (e.g., SMOTE [4]) or aggressive cutmix/mixup strategies that distort microvascular lesions, we implement a targeted "safe-light" data augmentation pipeline:</w:t>
+      </w:r>
+    </w:p>
+    <w:p>
+      <w:pPr>
+        <w:spacing w:before="20" w:after="40" w:line="276" w:lineRule="auto"/>
+        <w:ind w:left="432"/>
+      </w:pPr>
+      <w:r>
+        <w:rPr>
+          <w:rFonts w:ascii="Times New Roman" w:hAnsi="Times New Roman"/>
+          <w:b/>
+          <w:sz w:val="20"/>
+        </w:rPr>
+        <w:t xml:space="preserve">• </w:t>
+      </w:r>
+      <w:r>
+        <w:rPr>
+          <w:rFonts w:ascii="Times New Roman" w:hAnsi="Times New Roman"/>
+          <w:b w:val="0"/>
+          <w:i w:val="0"/>
+          <w:color w:val="1E1E1E"/>
+          <w:sz w:val="20"/>
+        </w:rPr>
+        <w:t>Random horizontal flip ($p=0.5$) and vertical flip ($p=0.5$).</w:t>
+      </w:r>
+    </w:p>
+    <w:p>
+      <w:pPr>
+        <w:spacing w:before="20" w:after="40" w:line="276" w:lineRule="auto"/>
+        <w:ind w:left="432"/>
+      </w:pPr>
+      <w:r>
+        <w:rPr>
+          <w:rFonts w:ascii="Times New Roman" w:hAnsi="Times New Roman"/>
+          <w:b/>
+          <w:sz w:val="20"/>
+        </w:rPr>
+        <w:t xml:space="preserve">• </w:t>
+      </w:r>
+      <w:r>
+        <w:rPr>
+          <w:rFonts w:ascii="Times New Roman" w:hAnsi="Times New Roman"/>
+          <w:b w:val="0"/>
+          <w:i w:val="0"/>
+          <w:color w:val="1E1E1E"/>
+          <w:sz w:val="20"/>
+        </w:rPr>
+        <w:t>Small-angle rotation bounded strictly within $\pm 15^\circ$.</w:t>
+      </w:r>
+    </w:p>
+    <w:p>
+      <w:pPr>
+        <w:spacing w:before="20" w:after="40" w:line="276" w:lineRule="auto"/>
+        <w:ind w:left="432"/>
+      </w:pPr>
+      <w:r>
+        <w:rPr>
+          <w:rFonts w:ascii="Times New Roman" w:hAnsi="Times New Roman"/>
+          <w:b/>
+          <w:sz w:val="20"/>
+        </w:rPr>
+        <w:t xml:space="preserve">• </w:t>
+      </w:r>
+      <w:r>
+        <w:rPr>
+          <w:rFonts w:ascii="Times New Roman" w:hAnsi="Times New Roman"/>
+          <w:b w:val="0"/>
+          <w:i w:val="0"/>
+          <w:color w:val="1E1E1E"/>
+          <w:sz w:val="20"/>
+        </w:rPr>
+        <w:t>Continuous affine zoom/scaling within $[0.92, 1.08]$ (preventing lesion distortion).</w:t>
+      </w:r>
+    </w:p>
+    <w:p>
+      <w:pPr>
+        <w:spacing w:before="20" w:after="40" w:line="276" w:lineRule="auto"/>
+        <w:ind w:left="432"/>
+      </w:pPr>
+      <w:r>
+        <w:rPr>
+          <w:rFonts w:ascii="Times New Roman" w:hAnsi="Times New Roman"/>
+          <w:b/>
+          <w:sz w:val="20"/>
+        </w:rPr>
+        <w:t xml:space="preserve">• </w:t>
+      </w:r>
+      <w:r>
+        <w:rPr>
+          <w:rFonts w:ascii="Times New Roman" w:hAnsi="Times New Roman"/>
+          <w:b w:val="0"/>
+          <w:i w:val="0"/>
+          <w:color w:val="1E1E1E"/>
+          <w:sz w:val="20"/>
+        </w:rPr>
+        <w:t>Mild photometric color jitter (brightness factor $\pm 0.10$, contrast factor $\pm 0.10$).</w:t>
+      </w:r>
+    </w:p>
+    <w:p>
+      <w:pPr>
+        <w:keepNext/>
+        <w:spacing w:before="120" w:after="40"/>
+      </w:pPr>
+      <w:r>
+        <w:rPr>
+          <w:rFonts w:ascii="Times New Roman" w:hAnsi="Times New Roman"/>
+          <w:b/>
+          <w:color w:val="323232"/>
+          <w:sz w:val="20"/>
+        </w:rPr>
+        <w:t>4) Post-Hoc Logit Adjustment (Menon et al.)</w:t>
+      </w:r>
+    </w:p>
+    <w:p>
+      <w:pPr>
+        <w:spacing w:before="0" w:after="90" w:line="276" w:lineRule="auto"/>
+        <w:jc w:val="both"/>
+      </w:pPr>
+      <w:r>
+        <w:rPr>
+          <w:rFonts w:ascii="Times New Roman" w:hAnsi="Times New Roman"/>
+          <w:b w:val="0"/>
+          <w:i w:val="0"/>
+          <w:color w:val="1E1E1E"/>
+          <w:sz w:val="20"/>
+        </w:rPr>
+        <w:t>To address the long-tailed class distribution ($49.3\%$ Grade 0 vs. $5.3\%$ Grade 3) at inference time without destabilizing network representation learning with artificial mini-batch sampling, we implement post-hoc logit adjustment [15]:</w:t>
+      </w:r>
+    </w:p>
+    <w:p>
+      <w:pPr>
+        <w:spacing w:before="0" w:after="90" w:line="276" w:lineRule="auto"/>
+        <w:jc w:val="both"/>
+      </w:pPr>
+      <w:r>
+        <w:rPr>
+          <w:rFonts w:ascii="Times New Roman" w:hAnsi="Times New Roman"/>
+          <w:b w:val="0"/>
+          <w:i w:val="0"/>
+          <w:color w:val="1E1E1E"/>
+          <w:sz w:val="20"/>
+        </w:rPr>
+        <w:t>$$\tilde{f}_y(\mathbf{x}) = f_y(\mathbf{x}) - \tau \cdot \log(\pi_y)$$</w:t>
+      </w:r>
+    </w:p>
+    <w:p>
+      <w:pPr>
+        <w:spacing w:before="0" w:after="90" w:line="276" w:lineRule="auto"/>
+        <w:jc w:val="both"/>
+      </w:pPr>
+      <w:r>
+        <w:rPr>
+          <w:rFonts w:ascii="Times New Roman" w:hAnsi="Times New Roman"/>
+          <w:b w:val="0"/>
+          <w:i w:val="0"/>
+          <w:color w:val="1E1E1E"/>
+          <w:sz w:val="20"/>
+        </w:rPr>
+        <w:t>where $f_y(\mathbf{x})$ denotes the unnormalized logit for grade $y$, $\pi_y = \frac{n_y}{N_{train}}$ is the empirical class prior estimated from the 2,563-image training distribution ($\pi_0 = 0.4928, \pi_1 = 0.1011, \pi_2 = 0.2727, \pi_3 = 0.0527, \pi_4 = 0.0808$), and $\tau \ge 0$ is a tunable temperature parameter.</w:t>
+      </w:r>
+    </w:p>
+    <w:p>
+      <w:pPr>
+        <w:spacing w:before="20" w:after="40" w:line="276" w:lineRule="auto"/>
+        <w:ind w:left="432"/>
+      </w:pPr>
+      <w:r>
+        <w:rPr>
+          <w:rFonts w:ascii="Times New Roman" w:hAnsi="Times New Roman"/>
+          <w:b/>
+          <w:sz w:val="20"/>
+        </w:rPr>
+        <w:t xml:space="preserve">• </w:t>
+      </w:r>
+      <w:r>
+        <w:rPr>
+          <w:rFonts w:ascii="Times New Roman" w:hAnsi="Times New Roman"/>
+          <w:b w:val="0"/>
+          <w:i w:val="0"/>
+          <w:color w:val="1E1E1E"/>
+          <w:sz w:val="20"/>
+        </w:rPr>
+        <w:t>When $\tau = 0.0$, the decision rule is standard $\arg\max_y f_y(\mathbf{x})$, which optimizes for empirical overall accuracy under the natural training prior.</w:t>
+      </w:r>
+    </w:p>
+    <w:p>
+      <w:pPr>
+        <w:spacing w:before="20" w:after="40" w:line="276" w:lineRule="auto"/>
+        <w:ind w:left="432"/>
+      </w:pPr>
+      <w:r>
+        <w:rPr>
+          <w:rFonts w:ascii="Times New Roman" w:hAnsi="Times New Roman"/>
+          <w:b/>
+          <w:sz w:val="20"/>
+        </w:rPr>
+        <w:t xml:space="preserve">• </w:t>
+      </w:r>
+      <w:r>
+        <w:rPr>
+          <w:rFonts w:ascii="Times New Roman" w:hAnsi="Times New Roman"/>
+          <w:b w:val="0"/>
+          <w:i w:val="0"/>
+          <w:color w:val="1E1E1E"/>
+          <w:sz w:val="20"/>
+        </w:rPr>
+        <w:t>When $\tau &gt; 0.0$, the term $-\tau \log(\pi_y)$ provides a larger additive bonus to scarce minority classes (e.g., $+2.9437\tau$ for Grade 3 vs. $+0.7077\tau$ for Grade 0), smoothly modulating the trade-off between raw classification accuracy and tail sensitivity at test time without requiring retraining.</w:t>
+      </w:r>
+    </w:p>
+    <w:p>
+      <w:pPr>
+        <w:keepNext/>
+        <w:spacing w:before="120" w:after="40"/>
+      </w:pPr>
+      <w:r>
+        <w:rPr>
+          <w:rFonts w:ascii="Times New Roman" w:hAnsi="Times New Roman"/>
+          <w:b/>
+          <w:color w:val="323232"/>
+          <w:sz w:val="20"/>
+        </w:rPr>
+        <w:t>5) Sequential Multi-Seed Ensembling with Test-Time Augmentation</w:t>
+      </w:r>
+    </w:p>
+    <w:p>
+      <w:pPr>
+        <w:spacing w:before="0" w:after="90" w:line="276" w:lineRule="auto"/>
+        <w:jc w:val="both"/>
+      </w:pPr>
+      <w:r>
+        <w:rPr>
+          <w:rFonts w:ascii="Times New Roman" w:hAnsi="Times New Roman"/>
+          <w:b w:val="0"/>
+          <w:i w:val="0"/>
+          <w:color w:val="1E1E1E"/>
+          <w:sz w:val="20"/>
+        </w:rPr>
+        <w:t>To eliminate single-run stochastic variance and maximize generalization, we train the label-smoothed Variant A architecture across three distinct random seeds ($s \in \{42, 43, 44\}$) sequentially. Each seed model undergoes 12 epochs with early stopping governed strictly by validation classification accuracy. At inference time, each model computes predictions across 4-way flip Test-Time Augmentation (TTA). The final ensemble prediction is formed by averaging the softmax probability distributions across all three seeds:</w:t>
+      </w:r>
+    </w:p>
+    <w:p>
+      <w:pPr>
+        <w:spacing w:before="0" w:after="90" w:line="276" w:lineRule="auto"/>
+        <w:jc w:val="both"/>
+      </w:pPr>
+      <w:r>
+        <w:rPr>
+          <w:rFonts w:ascii="Times New Roman" w:hAnsi="Times New Roman"/>
+          <w:b w:val="0"/>
+          <w:i w:val="0"/>
+          <w:color w:val="1E1E1E"/>
+          <w:sz w:val="20"/>
+        </w:rPr>
+        <w:t>$$\bar{P}(y = k \mid \mathbf{x}) = \frac{1}{3} \sum_{s=1}^3 P^{(s)}(y = k \mid \mathbf{x})$$</w:t>
+      </w:r>
+    </w:p>
+    <w:p>
+      <w:pPr>
+        <w:spacing w:before="0" w:after="90" w:line="276" w:lineRule="auto"/>
+        <w:jc w:val="both"/>
+      </w:pPr>
+      <w:r>
+        <w:rPr>
+          <w:rFonts w:ascii="Times New Roman" w:hAnsi="Times New Roman"/>
+          <w:b w:val="0"/>
+          <w:i w:val="0"/>
+          <w:color w:val="1E1E1E"/>
+          <w:sz w:val="20"/>
+        </w:rPr>
+        <w:t>Post-hoc logit adjustment is then applied directly to the ensembled distribution: $\tilde{P}(y \mid \mathbf{x}) \propto \bar{P}(y \mid \mathbf{x}) \cdot \pi_y^{-\tau}$.</w:t>
       </w:r>
     </w:p>
     <w:p>
@@ -9170,53 +9597,6 @@
     </w:p>
     <w:p>
       <w:pPr>
-        <w:spacing w:before="0" w:after="90" w:line="276" w:lineRule="auto"/>
-        <w:jc w:val="both"/>
-      </w:pPr>
-      <w:r>
-        <w:rPr>
-          <w:rFonts w:ascii="Times New Roman" w:hAnsi="Times New Roman"/>
-          <w:b w:val="0"/>
-          <w:i w:val="0"/>
-          <w:color w:val="1E1E1E"/>
-          <w:sz w:val="20"/>
-        </w:rPr>
-        <w:t>---</w:t>
-      </w:r>
-    </w:p>
-    <w:p>
-      <w:pPr>
-        <w:spacing w:before="0" w:after="90" w:line="276" w:lineRule="auto"/>
-        <w:jc w:val="both"/>
-      </w:pPr>
-      <w:r>
-        <w:rPr>
-          <w:rFonts w:ascii="Times New Roman" w:hAnsi="Times New Roman"/>
-          <w:b w:val="0"/>
-          <w:i w:val="0"/>
-          <w:color w:val="1E1E1E"/>
-          <w:sz w:val="20"/>
-        </w:rPr>
-        <w:t>---</w:t>
-      </w:r>
-    </w:p>
-    <w:p>
-      <w:pPr>
-        <w:keepNext/>
-        <w:spacing w:before="280" w:after="80"/>
-      </w:pPr>
-      <w:r>
-        <w:rPr>
-          <w:rFonts w:ascii="Times New Roman" w:hAnsi="Times New Roman"/>
-          <w:b/>
-          <w:color w:val="142850"/>
-          <w:sz w:val="23"/>
-        </w:rPr>
-        <w:t>VII. DISCUSSION AND CLINICAL IMPLICATIONS</w:t>
-      </w:r>
-    </w:p>
-    <w:p>
-      <w:pPr>
         <w:keepNext/>
         <w:spacing w:before="200" w:after="60"/>
       </w:pPr>
@@ -9228,7 +9608,7 @@
           <w:color w:val="283246"/>
           <w:sz w:val="21"/>
         </w:rPr>
-        <w:t>A. The Clinical Cost Asymmetry of Triage Errors</w:t>
+        <w:t>E. Empirical Results of Accuracy Optimization: Label Smoothing, Logit Adjustment, and 3-Seed Ensembling</w:t>
       </w:r>
     </w:p>
     <w:p>
@@ -9244,14 +9624,1371 @@
           <w:color w:val="1E1E1E"/>
           <w:sz w:val="20"/>
         </w:rPr>
-        <w:t>The primary contribution of this work is establishing that model evaluation for medical grading must transcend unweighted accuracy to consider the asymmetric clinical costs of diagnostic errors. In ophthalmic screening, a false positive between adjacent grades (e.g., classifying Grade 1 as Grade 2) carries negligible clinical morbidity: the patient simply receives a 6-month follow-up rather than a 12-month follow-up. In contrast, a false negative spanning multiple grades (e.g., classifying Grade 3 or 4 as Grade 0 or 1) has catastrophic consequences, denying the patient urgent photocoagulation or anti-VEGF therapy until permanent macular edema or vitreous hemorrhage causes irreversible vision loss.</w:t>
+        <w:t>Table III compares the empirical metrics produced across the accuracy-optimization experiments against the original Softmax baseline on the 550-image holdout test set ($N=550$).</w:t>
       </w:r>
     </w:p>
     <w:p>
       <w:pPr>
-        <w:spacing w:before="0" w:after="90" w:line="276" w:lineRule="auto"/>
-        <w:jc w:val="both"/>
-      </w:pPr>
+        <w:keepNext/>
+        <w:spacing w:before="120" w:after="40"/>
+      </w:pPr>
+      <w:r>
+        <w:rPr>
+          <w:rFonts w:ascii="Times New Roman" w:hAnsi="Times New Roman"/>
+          <w:b/>
+          <w:color w:val="323232"/>
+          <w:sz w:val="20"/>
+        </w:rPr>
+        <w:t>TABLE III: Classification Accuracy Optimization Comparison on Test Set (N=550)</w:t>
+      </w:r>
+    </w:p>
+    <w:tbl>
+      <w:tblPr>
+        <w:tblW w:type="auto" w:w="0"/>
+        <w:jc w:val="center"/>
+        <w:tblLook w:firstColumn="1" w:firstRow="1" w:lastColumn="0" w:lastRow="0" w:noHBand="0" w:noVBand="1" w:val="04A0"/>
+        <w:tblBorders>
+          <w:top w:val="single" w:sz="6" w:space="0" w:color="CCCCCC"/>
+          <w:bottom w:val="single" w:sz="8" w:space="0" w:color="333333"/>
+          <w:insideH w:val="single" w:sz="4" w:space="0" w:color="E0E0E0"/>
+          <w:insideV w:val="none"/>
+          <w:left w:val="none"/>
+          <w:right w:val="none"/>
+        </w:tblBorders>
+      </w:tblPr>
+      <w:tblGrid>
+        <w:gridCol w:w="1440"/>
+        <w:gridCol w:w="1440"/>
+        <w:gridCol w:w="1440"/>
+        <w:gridCol w:w="1440"/>
+        <w:gridCol w:w="1440"/>
+        <w:gridCol w:w="1440"/>
+        <w:gridCol w:w="1440"/>
+      </w:tblGrid>
+      <w:tr>
+        <w:tc>
+          <w:tcPr>
+            <w:tcW w:type="dxa" w:w="1440"/>
+            <w:vAlign w:val="center"/>
+            <w:tcMar>
+              <w:top w:w="120" w:type="dxa"/>
+              <w:bottom w:w="120" w:type="dxa"/>
+              <w:left w:w="140" w:type="dxa"/>
+              <w:right w:w="140" w:type="dxa"/>
+            </w:tcMar>
+            <w:shd w:fill="2B5C8F"/>
+          </w:tcPr>
+          <w:p>
+            <w:pPr>
+              <w:spacing w:before="20" w:after="20"/>
+              <w:jc w:val="center"/>
+            </w:pPr>
+            <w:r>
+              <w:rPr>
+                <w:rFonts w:ascii="Times New Roman" w:hAnsi="Times New Roman"/>
+                <w:b/>
+                <w:i w:val="0"/>
+                <w:color w:val="FFFFFF"/>
+                <w:sz w:val="18"/>
+              </w:rPr>
+              <w:t>Model Configuration</w:t>
+            </w:r>
+          </w:p>
+        </w:tc>
+        <w:tc>
+          <w:tcPr>
+            <w:tcW w:type="dxa" w:w="1440"/>
+            <w:vAlign w:val="center"/>
+            <w:tcMar>
+              <w:top w:w="120" w:type="dxa"/>
+              <w:bottom w:w="120" w:type="dxa"/>
+              <w:left w:w="140" w:type="dxa"/>
+              <w:right w:w="140" w:type="dxa"/>
+            </w:tcMar>
+            <w:shd w:fill="2B5C8F"/>
+          </w:tcPr>
+          <w:p>
+            <w:pPr>
+              <w:spacing w:before="20" w:after="20"/>
+              <w:jc w:val="center"/>
+            </w:pPr>
+            <w:r>
+              <w:rPr>
+                <w:rFonts w:ascii="Times New Roman" w:hAnsi="Times New Roman"/>
+                <w:b/>
+                <w:i w:val="0"/>
+                <w:color w:val="FFFFFF"/>
+                <w:sz w:val="18"/>
+              </w:rPr>
+              <w:t>Accuracy [95% CI]</w:t>
+            </w:r>
+          </w:p>
+        </w:tc>
+        <w:tc>
+          <w:tcPr>
+            <w:tcW w:type="dxa" w:w="1440"/>
+            <w:vAlign w:val="center"/>
+            <w:tcMar>
+              <w:top w:w="120" w:type="dxa"/>
+              <w:bottom w:w="120" w:type="dxa"/>
+              <w:left w:w="140" w:type="dxa"/>
+              <w:right w:w="140" w:type="dxa"/>
+            </w:tcMar>
+            <w:shd w:fill="2B5C8F"/>
+          </w:tcPr>
+          <w:p>
+            <w:pPr>
+              <w:spacing w:before="20" w:after="20"/>
+              <w:jc w:val="center"/>
+            </w:pPr>
+            <w:r>
+              <w:rPr>
+                <w:rFonts w:ascii="Times New Roman" w:hAnsi="Times New Roman"/>
+                <w:b/>
+                <w:i w:val="0"/>
+                <w:color w:val="FFFFFF"/>
+                <w:sz w:val="18"/>
+              </w:rPr>
+              <w:t>QWK [95% CI]</w:t>
+            </w:r>
+          </w:p>
+        </w:tc>
+        <w:tc>
+          <w:tcPr>
+            <w:tcW w:type="dxa" w:w="1440"/>
+            <w:vAlign w:val="center"/>
+            <w:tcMar>
+              <w:top w:w="120" w:type="dxa"/>
+              <w:bottom w:w="120" w:type="dxa"/>
+              <w:left w:w="140" w:type="dxa"/>
+              <w:right w:w="140" w:type="dxa"/>
+            </w:tcMar>
+            <w:shd w:fill="2B5C8F"/>
+          </w:tcPr>
+          <w:p>
+            <w:pPr>
+              <w:spacing w:before="20" w:after="20"/>
+              <w:jc w:val="center"/>
+            </w:pPr>
+            <w:r>
+              <w:rPr>
+                <w:rFonts w:ascii="Times New Roman" w:hAnsi="Times New Roman"/>
+                <w:b/>
+                <w:i w:val="0"/>
+                <w:color w:val="FFFFFF"/>
+                <w:sz w:val="18"/>
+              </w:rPr>
+              <w:t>MAE [95% CI]</w:t>
+            </w:r>
+          </w:p>
+        </w:tc>
+        <w:tc>
+          <w:tcPr>
+            <w:tcW w:type="dxa" w:w="1440"/>
+            <w:vAlign w:val="center"/>
+            <w:tcMar>
+              <w:top w:w="120" w:type="dxa"/>
+              <w:bottom w:w="120" w:type="dxa"/>
+              <w:left w:w="140" w:type="dxa"/>
+              <w:right w:w="140" w:type="dxa"/>
+            </w:tcMar>
+            <w:shd w:fill="2B5C8F"/>
+          </w:tcPr>
+          <w:p>
+            <w:pPr>
+              <w:spacing w:before="20" w:after="20"/>
+              <w:jc w:val="center"/>
+            </w:pPr>
+            <w:r>
+              <w:rPr>
+                <w:rFonts w:ascii="Times New Roman" w:hAnsi="Times New Roman"/>
+                <w:b/>
+                <w:i w:val="0"/>
+                <w:color w:val="FFFFFF"/>
+                <w:sz w:val="18"/>
+              </w:rPr>
+              <w:t>Catastrophic Err ($d \ge 2$) [95% CI]</w:t>
+            </w:r>
+          </w:p>
+        </w:tc>
+        <w:tc>
+          <w:tcPr>
+            <w:tcW w:type="dxa" w:w="1440"/>
+            <w:vAlign w:val="center"/>
+            <w:tcMar>
+              <w:top w:w="120" w:type="dxa"/>
+              <w:bottom w:w="120" w:type="dxa"/>
+              <w:left w:w="140" w:type="dxa"/>
+              <w:right w:w="140" w:type="dxa"/>
+            </w:tcMar>
+            <w:shd w:fill="2B5C8F"/>
+          </w:tcPr>
+          <w:p>
+            <w:pPr>
+              <w:spacing w:before="20" w:after="20"/>
+              <w:jc w:val="center"/>
+            </w:pPr>
+            <w:r>
+              <w:rPr>
+                <w:rFonts w:ascii="Times New Roman" w:hAnsi="Times New Roman"/>
+                <w:b/>
+                <w:i w:val="0"/>
+                <w:color w:val="FFFFFF"/>
+                <w:sz w:val="18"/>
+              </w:rPr>
+              <w:t>Grade 3 Severe F1 [95% CI]</w:t>
+            </w:r>
+          </w:p>
+        </w:tc>
+        <w:tc>
+          <w:tcPr>
+            <w:tcW w:type="dxa" w:w="1440"/>
+            <w:vAlign w:val="center"/>
+            <w:tcMar>
+              <w:top w:w="120" w:type="dxa"/>
+              <w:bottom w:w="120" w:type="dxa"/>
+              <w:left w:w="140" w:type="dxa"/>
+              <w:right w:w="140" w:type="dxa"/>
+            </w:tcMar>
+            <w:shd w:fill="2B5C8F"/>
+          </w:tcPr>
+          <w:p>
+            <w:pPr>
+              <w:spacing w:before="20" w:after="20"/>
+              <w:jc w:val="center"/>
+            </w:pPr>
+            <w:r>
+              <w:rPr>
+                <w:rFonts w:ascii="Times New Roman" w:hAnsi="Times New Roman"/>
+                <w:b/>
+                <w:i w:val="0"/>
+                <w:color w:val="FFFFFF"/>
+                <w:sz w:val="18"/>
+              </w:rPr>
+              <w:t>Grade 4 PDR F1 [95% CI]</w:t>
+            </w:r>
+          </w:p>
+        </w:tc>
+      </w:tr>
+      <w:tr>
+        <w:tc>
+          <w:tcPr>
+            <w:tcW w:type="dxa" w:w="1440"/>
+            <w:vAlign w:val="center"/>
+            <w:tcMar>
+              <w:top w:w="120" w:type="dxa"/>
+              <w:bottom w:w="120" w:type="dxa"/>
+              <w:left w:w="140" w:type="dxa"/>
+              <w:right w:w="140" w:type="dxa"/>
+            </w:tcMar>
+            <w:shd w:fill="F7F9FC"/>
+          </w:tcPr>
+          <w:p>
+            <w:pPr>
+              <w:spacing w:before="20" w:after="20"/>
+              <w:jc w:val="left"/>
+            </w:pPr>
+            <w:r>
+              <w:rPr>
+                <w:rFonts w:ascii="Times New Roman" w:hAnsi="Times New Roman"/>
+                <w:b/>
+                <w:i w:val="0"/>
+                <w:color w:val="1E1E1E"/>
+                <w:sz w:val="18"/>
+              </w:rPr>
+              <w:t>Original Variant A (Baseline Softmax)</w:t>
+            </w:r>
+          </w:p>
+        </w:tc>
+        <w:tc>
+          <w:tcPr>
+            <w:tcW w:type="dxa" w:w="1440"/>
+            <w:vAlign w:val="center"/>
+            <w:tcMar>
+              <w:top w:w="120" w:type="dxa"/>
+              <w:bottom w:w="120" w:type="dxa"/>
+              <w:left w:w="140" w:type="dxa"/>
+              <w:right w:w="140" w:type="dxa"/>
+            </w:tcMar>
+            <w:shd w:fill="F7F9FC"/>
+          </w:tcPr>
+          <w:p>
+            <w:pPr>
+              <w:spacing w:before="20" w:after="20"/>
+              <w:jc w:val="center"/>
+            </w:pPr>
+            <w:r>
+              <w:rPr>
+                <w:rFonts w:ascii="Times New Roman" w:hAnsi="Times New Roman"/>
+                <w:b w:val="0"/>
+                <w:i w:val="0"/>
+                <w:color w:val="1E1E1E"/>
+                <w:sz w:val="18"/>
+              </w:rPr>
+              <w:t>80.18% [76.73%, 83.45%]</w:t>
+            </w:r>
+          </w:p>
+        </w:tc>
+        <w:tc>
+          <w:tcPr>
+            <w:tcW w:type="dxa" w:w="1440"/>
+            <w:vAlign w:val="center"/>
+            <w:tcMar>
+              <w:top w:w="120" w:type="dxa"/>
+              <w:bottom w:w="120" w:type="dxa"/>
+              <w:left w:w="140" w:type="dxa"/>
+              <w:right w:w="140" w:type="dxa"/>
+            </w:tcMar>
+            <w:shd w:fill="F7F9FC"/>
+          </w:tcPr>
+          <w:p>
+            <w:pPr>
+              <w:spacing w:before="20" w:after="20"/>
+              <w:jc w:val="center"/>
+            </w:pPr>
+            <w:r>
+              <w:rPr>
+                <w:rFonts w:ascii="Times New Roman" w:hAnsi="Times New Roman"/>
+                <w:b w:val="0"/>
+                <w:i w:val="0"/>
+                <w:color w:val="1E1E1E"/>
+                <w:sz w:val="18"/>
+              </w:rPr>
+              <w:t>0.8724 [0.8385, 0.9044]</w:t>
+            </w:r>
+          </w:p>
+        </w:tc>
+        <w:tc>
+          <w:tcPr>
+            <w:tcW w:type="dxa" w:w="1440"/>
+            <w:vAlign w:val="center"/>
+            <w:tcMar>
+              <w:top w:w="120" w:type="dxa"/>
+              <w:bottom w:w="120" w:type="dxa"/>
+              <w:left w:w="140" w:type="dxa"/>
+              <w:right w:w="140" w:type="dxa"/>
+            </w:tcMar>
+            <w:shd w:fill="F7F9FC"/>
+          </w:tcPr>
+          <w:p>
+            <w:pPr>
+              <w:spacing w:before="20" w:after="20"/>
+              <w:jc w:val="center"/>
+            </w:pPr>
+            <w:r>
+              <w:rPr>
+                <w:rFonts w:ascii="Times New Roman" w:hAnsi="Times New Roman"/>
+                <w:b w:val="0"/>
+                <w:i w:val="0"/>
+                <w:color w:val="1E1E1E"/>
+                <w:sz w:val="18"/>
+              </w:rPr>
+              <w:t>0.2673 [0.2182, 0.3200]</w:t>
+            </w:r>
+          </w:p>
+        </w:tc>
+        <w:tc>
+          <w:tcPr>
+            <w:tcW w:type="dxa" w:w="1440"/>
+            <w:vAlign w:val="center"/>
+            <w:tcMar>
+              <w:top w:w="120" w:type="dxa"/>
+              <w:bottom w:w="120" w:type="dxa"/>
+              <w:left w:w="140" w:type="dxa"/>
+              <w:right w:w="140" w:type="dxa"/>
+            </w:tcMar>
+            <w:shd w:fill="F7F9FC"/>
+          </w:tcPr>
+          <w:p>
+            <w:pPr>
+              <w:spacing w:before="20" w:after="20"/>
+              <w:jc w:val="center"/>
+            </w:pPr>
+            <w:r>
+              <w:rPr>
+                <w:rFonts w:ascii="Times New Roman" w:hAnsi="Times New Roman"/>
+                <w:b w:val="0"/>
+                <w:i w:val="0"/>
+                <w:color w:val="1E1E1E"/>
+                <w:sz w:val="18"/>
+              </w:rPr>
+              <w:t>5.64% [3.64%, 7.64%]</w:t>
+            </w:r>
+          </w:p>
+        </w:tc>
+        <w:tc>
+          <w:tcPr>
+            <w:tcW w:type="dxa" w:w="1440"/>
+            <w:vAlign w:val="center"/>
+            <w:tcMar>
+              <w:top w:w="120" w:type="dxa"/>
+              <w:bottom w:w="120" w:type="dxa"/>
+              <w:left w:w="140" w:type="dxa"/>
+              <w:right w:w="140" w:type="dxa"/>
+            </w:tcMar>
+            <w:shd w:fill="F7F9FC"/>
+          </w:tcPr>
+          <w:p>
+            <w:pPr>
+              <w:spacing w:before="20" w:after="20"/>
+              <w:jc w:val="center"/>
+            </w:pPr>
+            <w:r>
+              <w:rPr>
+                <w:rFonts w:ascii="Times New Roman" w:hAnsi="Times New Roman"/>
+                <w:b w:val="0"/>
+                <w:i w:val="0"/>
+                <w:color w:val="1E1E1E"/>
+                <w:sz w:val="18"/>
+              </w:rPr>
+              <w:t>0.3810 [0.2221, 0.5313]</w:t>
+            </w:r>
+          </w:p>
+        </w:tc>
+        <w:tc>
+          <w:tcPr>
+            <w:tcW w:type="dxa" w:w="1440"/>
+            <w:vAlign w:val="center"/>
+            <w:tcMar>
+              <w:top w:w="120" w:type="dxa"/>
+              <w:bottom w:w="120" w:type="dxa"/>
+              <w:left w:w="140" w:type="dxa"/>
+              <w:right w:w="140" w:type="dxa"/>
+            </w:tcMar>
+            <w:shd w:fill="F7F9FC"/>
+          </w:tcPr>
+          <w:p>
+            <w:pPr>
+              <w:spacing w:before="20" w:after="20"/>
+              <w:jc w:val="center"/>
+            </w:pPr>
+            <w:r>
+              <w:rPr>
+                <w:rFonts w:ascii="Times New Roman" w:hAnsi="Times New Roman"/>
+                <w:b w:val="0"/>
+                <w:i w:val="0"/>
+                <w:color w:val="1E1E1E"/>
+                <w:sz w:val="18"/>
+              </w:rPr>
+              <w:t>0.5169 [0.3830, 0.6377]</w:t>
+            </w:r>
+          </w:p>
+        </w:tc>
+      </w:tr>
+      <w:tr>
+        <w:tc>
+          <w:tcPr>
+            <w:tcW w:type="dxa" w:w="1440"/>
+            <w:vAlign w:val="center"/>
+            <w:tcMar>
+              <w:top w:w="120" w:type="dxa"/>
+              <w:bottom w:w="120" w:type="dxa"/>
+              <w:left w:w="140" w:type="dxa"/>
+              <w:right w:w="140" w:type="dxa"/>
+            </w:tcMar>
+            <w:shd w:fill="FFFFFF"/>
+          </w:tcPr>
+          <w:p>
+            <w:pPr>
+              <w:spacing w:before="20" w:after="20"/>
+              <w:jc w:val="left"/>
+            </w:pPr>
+            <w:r>
+              <w:rPr>
+                <w:rFonts w:ascii="Times New Roman" w:hAnsi="Times New Roman"/>
+                <w:b/>
+                <w:i w:val="0"/>
+                <w:color w:val="1E1E1E"/>
+                <w:sz w:val="18"/>
+              </w:rPr>
+              <w:t>Variant A (Single Seed 42 + Label Smooth 0.08)</w:t>
+            </w:r>
+          </w:p>
+        </w:tc>
+        <w:tc>
+          <w:tcPr>
+            <w:tcW w:type="dxa" w:w="1440"/>
+            <w:vAlign w:val="center"/>
+            <w:tcMar>
+              <w:top w:w="120" w:type="dxa"/>
+              <w:bottom w:w="120" w:type="dxa"/>
+              <w:left w:w="140" w:type="dxa"/>
+              <w:right w:w="140" w:type="dxa"/>
+            </w:tcMar>
+            <w:shd w:fill="FFFFFF"/>
+          </w:tcPr>
+          <w:p>
+            <w:pPr>
+              <w:spacing w:before="20" w:after="20"/>
+              <w:jc w:val="center"/>
+            </w:pPr>
+            <w:r>
+              <w:rPr>
+                <w:rFonts w:ascii="Times New Roman" w:hAnsi="Times New Roman"/>
+                <w:b w:val="0"/>
+                <w:i w:val="0"/>
+                <w:color w:val="1E1E1E"/>
+                <w:sz w:val="18"/>
+              </w:rPr>
+              <w:t>82.00% [78.73%, 85.10%]</w:t>
+            </w:r>
+          </w:p>
+        </w:tc>
+        <w:tc>
+          <w:tcPr>
+            <w:tcW w:type="dxa" w:w="1440"/>
+            <w:vAlign w:val="center"/>
+            <w:tcMar>
+              <w:top w:w="120" w:type="dxa"/>
+              <w:bottom w:w="120" w:type="dxa"/>
+              <w:left w:w="140" w:type="dxa"/>
+              <w:right w:w="140" w:type="dxa"/>
+            </w:tcMar>
+            <w:shd w:fill="FFFFFF"/>
+          </w:tcPr>
+          <w:p>
+            <w:pPr>
+              <w:spacing w:before="20" w:after="20"/>
+              <w:jc w:val="center"/>
+            </w:pPr>
+            <w:r>
+              <w:rPr>
+                <w:rFonts w:ascii="Times New Roman" w:hAnsi="Times New Roman"/>
+                <w:b w:val="0"/>
+                <w:i w:val="0"/>
+                <w:color w:val="1E1E1E"/>
+                <w:sz w:val="18"/>
+              </w:rPr>
+              <w:t>0.8709 [0.8330, 0.9039]</w:t>
+            </w:r>
+          </w:p>
+        </w:tc>
+        <w:tc>
+          <w:tcPr>
+            <w:tcW w:type="dxa" w:w="1440"/>
+            <w:vAlign w:val="center"/>
+            <w:tcMar>
+              <w:top w:w="120" w:type="dxa"/>
+              <w:bottom w:w="120" w:type="dxa"/>
+              <w:left w:w="140" w:type="dxa"/>
+              <w:right w:w="140" w:type="dxa"/>
+            </w:tcMar>
+            <w:shd w:fill="FFFFFF"/>
+          </w:tcPr>
+          <w:p>
+            <w:pPr>
+              <w:spacing w:before="20" w:after="20"/>
+              <w:jc w:val="center"/>
+            </w:pPr>
+            <w:r>
+              <w:rPr>
+                <w:rFonts w:ascii="Times New Roman" w:hAnsi="Times New Roman"/>
+                <w:b w:val="0"/>
+                <w:i w:val="0"/>
+                <w:color w:val="1E1E1E"/>
+                <w:sz w:val="18"/>
+              </w:rPr>
+              <w:t>0.2473 [0.1982, 0.3000]</w:t>
+            </w:r>
+          </w:p>
+        </w:tc>
+        <w:tc>
+          <w:tcPr>
+            <w:tcW w:type="dxa" w:w="1440"/>
+            <w:vAlign w:val="center"/>
+            <w:tcMar>
+              <w:top w:w="120" w:type="dxa"/>
+              <w:bottom w:w="120" w:type="dxa"/>
+              <w:left w:w="140" w:type="dxa"/>
+              <w:right w:w="140" w:type="dxa"/>
+            </w:tcMar>
+            <w:shd w:fill="FFFFFF"/>
+          </w:tcPr>
+          <w:p>
+            <w:pPr>
+              <w:spacing w:before="20" w:after="20"/>
+              <w:jc w:val="center"/>
+            </w:pPr>
+            <w:r>
+              <w:rPr>
+                <w:rFonts w:ascii="Times New Roman" w:hAnsi="Times New Roman"/>
+                <w:b w:val="0"/>
+                <w:i w:val="0"/>
+                <w:color w:val="1E1E1E"/>
+                <w:sz w:val="18"/>
+              </w:rPr>
+              <w:t>5.27% [3.45%, 7.27%]</w:t>
+            </w:r>
+          </w:p>
+        </w:tc>
+        <w:tc>
+          <w:tcPr>
+            <w:tcW w:type="dxa" w:w="1440"/>
+            <w:vAlign w:val="center"/>
+            <w:tcMar>
+              <w:top w:w="120" w:type="dxa"/>
+              <w:bottom w:w="120" w:type="dxa"/>
+              <w:left w:w="140" w:type="dxa"/>
+              <w:right w:w="140" w:type="dxa"/>
+            </w:tcMar>
+            <w:shd w:fill="FFFFFF"/>
+          </w:tcPr>
+          <w:p>
+            <w:pPr>
+              <w:spacing w:before="20" w:after="20"/>
+              <w:jc w:val="center"/>
+            </w:pPr>
+            <w:r>
+              <w:rPr>
+                <w:rFonts w:ascii="Times New Roman" w:hAnsi="Times New Roman"/>
+                <w:b w:val="0"/>
+                <w:i w:val="0"/>
+                <w:color w:val="1E1E1E"/>
+                <w:sz w:val="18"/>
+              </w:rPr>
+              <w:t>0.4828 [0.3225, 0.6452]</w:t>
+            </w:r>
+          </w:p>
+        </w:tc>
+        <w:tc>
+          <w:tcPr>
+            <w:tcW w:type="dxa" w:w="1440"/>
+            <w:vAlign w:val="center"/>
+            <w:tcMar>
+              <w:top w:w="120" w:type="dxa"/>
+              <w:bottom w:w="120" w:type="dxa"/>
+              <w:left w:w="140" w:type="dxa"/>
+              <w:right w:w="140" w:type="dxa"/>
+            </w:tcMar>
+            <w:shd w:fill="FFFFFF"/>
+          </w:tcPr>
+          <w:p>
+            <w:pPr>
+              <w:spacing w:before="20" w:after="20"/>
+              <w:jc w:val="center"/>
+            </w:pPr>
+            <w:r>
+              <w:rPr>
+                <w:rFonts w:ascii="Times New Roman" w:hAnsi="Times New Roman"/>
+                <w:b w:val="0"/>
+                <w:i w:val="0"/>
+                <w:color w:val="1E1E1E"/>
+                <w:sz w:val="18"/>
+              </w:rPr>
+              <w:t>0.5195 [0.3662, 0.6364]</w:t>
+            </w:r>
+          </w:p>
+        </w:tc>
+      </w:tr>
+      <w:tr>
+        <w:tc>
+          <w:tcPr>
+            <w:tcW w:type="dxa" w:w="1440"/>
+            <w:vAlign w:val="center"/>
+            <w:tcMar>
+              <w:top w:w="120" w:type="dxa"/>
+              <w:bottom w:w="120" w:type="dxa"/>
+              <w:left w:w="140" w:type="dxa"/>
+              <w:right w:w="140" w:type="dxa"/>
+            </w:tcMar>
+            <w:shd w:fill="F7F9FC"/>
+          </w:tcPr>
+          <w:p>
+            <w:pPr>
+              <w:spacing w:before="20" w:after="20"/>
+              <w:jc w:val="left"/>
+            </w:pPr>
+            <w:r>
+              <w:rPr>
+                <w:rFonts w:ascii="Times New Roman" w:hAnsi="Times New Roman"/>
+                <w:b/>
+                <w:i w:val="0"/>
+                <w:color w:val="1E1E1E"/>
+                <w:sz w:val="18"/>
+              </w:rPr>
+              <w:t>Variant A (Single Seed 42 + Logit Adj $\tau=1.0$)</w:t>
+            </w:r>
+          </w:p>
+        </w:tc>
+        <w:tc>
+          <w:tcPr>
+            <w:tcW w:type="dxa" w:w="1440"/>
+            <w:vAlign w:val="center"/>
+            <w:tcMar>
+              <w:top w:w="120" w:type="dxa"/>
+              <w:bottom w:w="120" w:type="dxa"/>
+              <w:left w:w="140" w:type="dxa"/>
+              <w:right w:w="140" w:type="dxa"/>
+            </w:tcMar>
+            <w:shd w:fill="F7F9FC"/>
+          </w:tcPr>
+          <w:p>
+            <w:pPr>
+              <w:spacing w:before="20" w:after="20"/>
+              <w:jc w:val="center"/>
+            </w:pPr>
+            <w:r>
+              <w:rPr>
+                <w:rFonts w:ascii="Times New Roman" w:hAnsi="Times New Roman"/>
+                <w:b w:val="0"/>
+                <w:i w:val="0"/>
+                <w:color w:val="1E1E1E"/>
+                <w:sz w:val="18"/>
+              </w:rPr>
+              <w:t>80.00% [76.73%, 83.46%]</w:t>
+            </w:r>
+          </w:p>
+        </w:tc>
+        <w:tc>
+          <w:tcPr>
+            <w:tcW w:type="dxa" w:w="1440"/>
+            <w:vAlign w:val="center"/>
+            <w:tcMar>
+              <w:top w:w="120" w:type="dxa"/>
+              <w:bottom w:w="120" w:type="dxa"/>
+              <w:left w:w="140" w:type="dxa"/>
+              <w:right w:w="140" w:type="dxa"/>
+            </w:tcMar>
+            <w:shd w:fill="F7F9FC"/>
+          </w:tcPr>
+          <w:p>
+            <w:pPr>
+              <w:spacing w:before="20" w:after="20"/>
+              <w:jc w:val="center"/>
+            </w:pPr>
+            <w:r>
+              <w:rPr>
+                <w:rFonts w:ascii="Times New Roman" w:hAnsi="Times New Roman"/>
+                <w:b w:val="0"/>
+                <w:i w:val="0"/>
+                <w:color w:val="1E1E1E"/>
+                <w:sz w:val="18"/>
+              </w:rPr>
+              <w:t>0.8682 [0.8303, 0.9010]</w:t>
+            </w:r>
+          </w:p>
+        </w:tc>
+        <w:tc>
+          <w:tcPr>
+            <w:tcW w:type="dxa" w:w="1440"/>
+            <w:vAlign w:val="center"/>
+            <w:tcMar>
+              <w:top w:w="120" w:type="dxa"/>
+              <w:bottom w:w="120" w:type="dxa"/>
+              <w:left w:w="140" w:type="dxa"/>
+              <w:right w:w="140" w:type="dxa"/>
+            </w:tcMar>
+            <w:shd w:fill="F7F9FC"/>
+          </w:tcPr>
+          <w:p>
+            <w:pPr>
+              <w:spacing w:before="20" w:after="20"/>
+              <w:jc w:val="center"/>
+            </w:pPr>
+            <w:r>
+              <w:rPr>
+                <w:rFonts w:ascii="Times New Roman" w:hAnsi="Times New Roman"/>
+                <w:b w:val="0"/>
+                <w:i w:val="0"/>
+                <w:color w:val="1E1E1E"/>
+                <w:sz w:val="18"/>
+              </w:rPr>
+              <w:t>0.2673 [0.2145, 0.3200]</w:t>
+            </w:r>
+          </w:p>
+        </w:tc>
+        <w:tc>
+          <w:tcPr>
+            <w:tcW w:type="dxa" w:w="1440"/>
+            <w:vAlign w:val="center"/>
+            <w:tcMar>
+              <w:top w:w="120" w:type="dxa"/>
+              <w:bottom w:w="120" w:type="dxa"/>
+              <w:left w:w="140" w:type="dxa"/>
+              <w:right w:w="140" w:type="dxa"/>
+            </w:tcMar>
+            <w:shd w:fill="F7F9FC"/>
+          </w:tcPr>
+          <w:p>
+            <w:pPr>
+              <w:spacing w:before="20" w:after="20"/>
+              <w:jc w:val="center"/>
+            </w:pPr>
+            <w:r>
+              <w:rPr>
+                <w:rFonts w:ascii="Times New Roman" w:hAnsi="Times New Roman"/>
+                <w:b w:val="0"/>
+                <w:i w:val="0"/>
+                <w:color w:val="1E1E1E"/>
+                <w:sz w:val="18"/>
+              </w:rPr>
+              <w:t>4.91% [3.27%, 6.73%]</w:t>
+            </w:r>
+          </w:p>
+        </w:tc>
+        <w:tc>
+          <w:tcPr>
+            <w:tcW w:type="dxa" w:w="1440"/>
+            <w:vAlign w:val="center"/>
+            <w:tcMar>
+              <w:top w:w="120" w:type="dxa"/>
+              <w:bottom w:w="120" w:type="dxa"/>
+              <w:left w:w="140" w:type="dxa"/>
+              <w:right w:w="140" w:type="dxa"/>
+            </w:tcMar>
+            <w:shd w:fill="F7F9FC"/>
+          </w:tcPr>
+          <w:p>
+            <w:pPr>
+              <w:spacing w:before="20" w:after="20"/>
+              <w:jc w:val="center"/>
+            </w:pPr>
+            <w:r>
+              <w:rPr>
+                <w:rFonts w:ascii="Times New Roman" w:hAnsi="Times New Roman"/>
+                <w:b w:val="0"/>
+                <w:i w:val="0"/>
+                <w:color w:val="1E1E1E"/>
+                <w:sz w:val="18"/>
+              </w:rPr>
+              <w:t>0.4000 [0.2597, 0.5306]</w:t>
+            </w:r>
+          </w:p>
+        </w:tc>
+        <w:tc>
+          <w:tcPr>
+            <w:tcW w:type="dxa" w:w="1440"/>
+            <w:vAlign w:val="center"/>
+            <w:tcMar>
+              <w:top w:w="120" w:type="dxa"/>
+              <w:bottom w:w="120" w:type="dxa"/>
+              <w:left w:w="140" w:type="dxa"/>
+              <w:right w:w="140" w:type="dxa"/>
+            </w:tcMar>
+            <w:shd w:fill="F7F9FC"/>
+          </w:tcPr>
+          <w:p>
+            <w:pPr>
+              <w:spacing w:before="20" w:after="20"/>
+              <w:jc w:val="center"/>
+            </w:pPr>
+            <w:r>
+              <w:rPr>
+                <w:rFonts w:ascii="Times New Roman" w:hAnsi="Times New Roman"/>
+                <w:b w:val="0"/>
+                <w:i w:val="0"/>
+                <w:color w:val="1E1E1E"/>
+                <w:sz w:val="18"/>
+              </w:rPr>
+              <w:t>0.5250 [0.3793, 0.6458]</w:t>
+            </w:r>
+          </w:p>
+        </w:tc>
+      </w:tr>
+      <w:tr>
+        <w:tc>
+          <w:tcPr>
+            <w:tcW w:type="dxa" w:w="1440"/>
+            <w:vAlign w:val="center"/>
+            <w:tcMar>
+              <w:top w:w="120" w:type="dxa"/>
+              <w:bottom w:w="120" w:type="dxa"/>
+              <w:left w:w="140" w:type="dxa"/>
+              <w:right w:w="140" w:type="dxa"/>
+            </w:tcMar>
+            <w:shd w:fill="FFFFFF"/>
+          </w:tcPr>
+          <w:p>
+            <w:pPr>
+              <w:spacing w:before="20" w:after="20"/>
+              <w:jc w:val="left"/>
+            </w:pPr>
+            <w:r>
+              <w:rPr>
+                <w:rFonts w:ascii="Times New Roman" w:hAnsi="Times New Roman"/>
+                <w:b/>
+                <w:i w:val="0"/>
+                <w:color w:val="1E1E1E"/>
+                <w:sz w:val="18"/>
+              </w:rPr>
+              <w:t>3-Seed Ensemble + TTA ($\tau=0.0$, Raw Acc Focus)</w:t>
+            </w:r>
+          </w:p>
+        </w:tc>
+        <w:tc>
+          <w:tcPr>
+            <w:tcW w:type="dxa" w:w="1440"/>
+            <w:vAlign w:val="center"/>
+            <w:tcMar>
+              <w:top w:w="120" w:type="dxa"/>
+              <w:bottom w:w="120" w:type="dxa"/>
+              <w:left w:w="140" w:type="dxa"/>
+              <w:right w:w="140" w:type="dxa"/>
+            </w:tcMar>
+            <w:shd w:fill="FFFFFF"/>
+          </w:tcPr>
+          <w:p>
+            <w:pPr>
+              <w:spacing w:before="20" w:after="20"/>
+              <w:jc w:val="center"/>
+            </w:pPr>
+            <w:r>
+              <w:rPr>
+                <w:rFonts w:ascii="Times New Roman" w:hAnsi="Times New Roman"/>
+                <w:b/>
+                <w:i w:val="0"/>
+                <w:color w:val="1E1E1E"/>
+                <w:sz w:val="18"/>
+              </w:rPr>
+              <w:t>83.82%</w:t>
+            </w:r>
+            <w:r>
+              <w:rPr>
+                <w:rFonts w:ascii="Times New Roman" w:hAnsi="Times New Roman"/>
+                <w:b w:val="0"/>
+                <w:i w:val="0"/>
+                <w:color w:val="1E1E1E"/>
+                <w:sz w:val="18"/>
+              </w:rPr>
+              <w:t xml:space="preserve"> [80.73%, 86.73%]</w:t>
+            </w:r>
+          </w:p>
+        </w:tc>
+        <w:tc>
+          <w:tcPr>
+            <w:tcW w:type="dxa" w:w="1440"/>
+            <w:vAlign w:val="center"/>
+            <w:tcMar>
+              <w:top w:w="120" w:type="dxa"/>
+              <w:bottom w:w="120" w:type="dxa"/>
+              <w:left w:w="140" w:type="dxa"/>
+              <w:right w:w="140" w:type="dxa"/>
+            </w:tcMar>
+            <w:shd w:fill="FFFFFF"/>
+          </w:tcPr>
+          <w:p>
+            <w:pPr>
+              <w:spacing w:before="20" w:after="20"/>
+              <w:jc w:val="center"/>
+            </w:pPr>
+            <w:r>
+              <w:rPr>
+                <w:rFonts w:ascii="Times New Roman" w:hAnsi="Times New Roman"/>
+                <w:b/>
+                <w:i w:val="0"/>
+                <w:color w:val="1E1E1E"/>
+                <w:sz w:val="18"/>
+              </w:rPr>
+              <w:t>0.8859</w:t>
+            </w:r>
+            <w:r>
+              <w:rPr>
+                <w:rFonts w:ascii="Times New Roman" w:hAnsi="Times New Roman"/>
+                <w:b w:val="0"/>
+                <w:i w:val="0"/>
+                <w:color w:val="1E1E1E"/>
+                <w:sz w:val="18"/>
+              </w:rPr>
+              <w:t xml:space="preserve"> [0.8503, 0.9170]</w:t>
+            </w:r>
+          </w:p>
+        </w:tc>
+        <w:tc>
+          <w:tcPr>
+            <w:tcW w:type="dxa" w:w="1440"/>
+            <w:vAlign w:val="center"/>
+            <w:tcMar>
+              <w:top w:w="120" w:type="dxa"/>
+              <w:bottom w:w="120" w:type="dxa"/>
+              <w:left w:w="140" w:type="dxa"/>
+              <w:right w:w="140" w:type="dxa"/>
+            </w:tcMar>
+            <w:shd w:fill="FFFFFF"/>
+          </w:tcPr>
+          <w:p>
+            <w:pPr>
+              <w:spacing w:before="20" w:after="20"/>
+              <w:jc w:val="center"/>
+            </w:pPr>
+            <w:r>
+              <w:rPr>
+                <w:rFonts w:ascii="Times New Roman" w:hAnsi="Times New Roman"/>
+                <w:b/>
+                <w:i w:val="0"/>
+                <w:color w:val="1E1E1E"/>
+                <w:sz w:val="18"/>
+              </w:rPr>
+              <w:t>0.2200</w:t>
+            </w:r>
+            <w:r>
+              <w:rPr>
+                <w:rFonts w:ascii="Times New Roman" w:hAnsi="Times New Roman"/>
+                <w:b w:val="0"/>
+                <w:i w:val="0"/>
+                <w:color w:val="1E1E1E"/>
+                <w:sz w:val="18"/>
+              </w:rPr>
+              <w:t xml:space="preserve"> [0.1727, 0.2691]</w:t>
+            </w:r>
+          </w:p>
+        </w:tc>
+        <w:tc>
+          <w:tcPr>
+            <w:tcW w:type="dxa" w:w="1440"/>
+            <w:vAlign w:val="center"/>
+            <w:tcMar>
+              <w:top w:w="120" w:type="dxa"/>
+              <w:bottom w:w="120" w:type="dxa"/>
+              <w:left w:w="140" w:type="dxa"/>
+              <w:right w:w="140" w:type="dxa"/>
+            </w:tcMar>
+            <w:shd w:fill="FFFFFF"/>
+          </w:tcPr>
+          <w:p>
+            <w:pPr>
+              <w:spacing w:before="20" w:after="20"/>
+              <w:jc w:val="center"/>
+            </w:pPr>
+            <w:r>
+              <w:rPr>
+                <w:rFonts w:ascii="Times New Roman" w:hAnsi="Times New Roman"/>
+                <w:b/>
+                <w:i w:val="0"/>
+                <w:color w:val="1E1E1E"/>
+                <w:sz w:val="18"/>
+              </w:rPr>
+              <w:t>4.36%</w:t>
+            </w:r>
+            <w:r>
+              <w:rPr>
+                <w:rFonts w:ascii="Times New Roman" w:hAnsi="Times New Roman"/>
+                <w:b w:val="0"/>
+                <w:i w:val="0"/>
+                <w:color w:val="1E1E1E"/>
+                <w:sz w:val="18"/>
+              </w:rPr>
+              <w:t xml:space="preserve"> [2.73%, 6.18%]</w:t>
+            </w:r>
+          </w:p>
+        </w:tc>
+        <w:tc>
+          <w:tcPr>
+            <w:tcW w:type="dxa" w:w="1440"/>
+            <w:vAlign w:val="center"/>
+            <w:tcMar>
+              <w:top w:w="120" w:type="dxa"/>
+              <w:bottom w:w="120" w:type="dxa"/>
+              <w:left w:w="140" w:type="dxa"/>
+              <w:right w:w="140" w:type="dxa"/>
+            </w:tcMar>
+            <w:shd w:fill="FFFFFF"/>
+          </w:tcPr>
+          <w:p>
+            <w:pPr>
+              <w:spacing w:before="20" w:after="20"/>
+              <w:jc w:val="center"/>
+            </w:pPr>
+            <w:r>
+              <w:rPr>
+                <w:rFonts w:ascii="Times New Roman" w:hAnsi="Times New Roman"/>
+                <w:b w:val="0"/>
+                <w:i w:val="0"/>
+                <w:color w:val="1E1E1E"/>
+                <w:sz w:val="18"/>
+              </w:rPr>
+              <w:t>0.4561 [0.2999, 0.6134]</w:t>
+            </w:r>
+          </w:p>
+        </w:tc>
+        <w:tc>
+          <w:tcPr>
+            <w:tcW w:type="dxa" w:w="1440"/>
+            <w:vAlign w:val="center"/>
+            <w:tcMar>
+              <w:top w:w="120" w:type="dxa"/>
+              <w:bottom w:w="120" w:type="dxa"/>
+              <w:left w:w="140" w:type="dxa"/>
+              <w:right w:w="140" w:type="dxa"/>
+            </w:tcMar>
+            <w:shd w:fill="FFFFFF"/>
+          </w:tcPr>
+          <w:p>
+            <w:pPr>
+              <w:spacing w:before="20" w:after="20"/>
+              <w:jc w:val="center"/>
+            </w:pPr>
+            <w:r>
+              <w:rPr>
+                <w:rFonts w:ascii="Times New Roman" w:hAnsi="Times New Roman"/>
+                <w:b w:val="0"/>
+                <w:i w:val="0"/>
+                <w:color w:val="1E1E1E"/>
+                <w:sz w:val="18"/>
+              </w:rPr>
+              <w:t>0.5570 [0.4179, 0.6739]</w:t>
+            </w:r>
+          </w:p>
+        </w:tc>
+      </w:tr>
+      <w:tr>
+        <w:tc>
+          <w:tcPr>
+            <w:tcW w:type="dxa" w:w="1440"/>
+            <w:vAlign w:val="center"/>
+            <w:tcMar>
+              <w:top w:w="120" w:type="dxa"/>
+              <w:bottom w:w="120" w:type="dxa"/>
+              <w:left w:w="140" w:type="dxa"/>
+              <w:right w:w="140" w:type="dxa"/>
+            </w:tcMar>
+            <w:shd w:fill="F7F9FC"/>
+          </w:tcPr>
+          <w:p>
+            <w:pPr>
+              <w:spacing w:before="20" w:after="20"/>
+              <w:jc w:val="left"/>
+            </w:pPr>
+            <w:r>
+              <w:rPr>
+                <w:rFonts w:ascii="Times New Roman" w:hAnsi="Times New Roman"/>
+                <w:b/>
+                <w:i w:val="0"/>
+                <w:color w:val="1E1E1E"/>
+                <w:sz w:val="18"/>
+              </w:rPr>
+              <w:t>3-Seed Ensemble + TTA ($\tau=1.0$, Logit Adj Focus)</w:t>
+            </w:r>
+          </w:p>
+        </w:tc>
+        <w:tc>
+          <w:tcPr>
+            <w:tcW w:type="dxa" w:w="1440"/>
+            <w:vAlign w:val="center"/>
+            <w:tcMar>
+              <w:top w:w="120" w:type="dxa"/>
+              <w:bottom w:w="120" w:type="dxa"/>
+              <w:left w:w="140" w:type="dxa"/>
+              <w:right w:w="140" w:type="dxa"/>
+            </w:tcMar>
+            <w:shd w:fill="F7F9FC"/>
+          </w:tcPr>
+          <w:p>
+            <w:pPr>
+              <w:spacing w:before="20" w:after="20"/>
+              <w:jc w:val="center"/>
+            </w:pPr>
+            <w:r>
+              <w:rPr>
+                <w:rFonts w:ascii="Times New Roman" w:hAnsi="Times New Roman"/>
+                <w:b w:val="0"/>
+                <w:i w:val="0"/>
+                <w:color w:val="1E1E1E"/>
+                <w:sz w:val="18"/>
+              </w:rPr>
+              <w:t>79.27% [76.00%, 82.55%]</w:t>
+            </w:r>
+          </w:p>
+        </w:tc>
+        <w:tc>
+          <w:tcPr>
+            <w:tcW w:type="dxa" w:w="1440"/>
+            <w:vAlign w:val="center"/>
+            <w:tcMar>
+              <w:top w:w="120" w:type="dxa"/>
+              <w:bottom w:w="120" w:type="dxa"/>
+              <w:left w:w="140" w:type="dxa"/>
+              <w:right w:w="140" w:type="dxa"/>
+            </w:tcMar>
+            <w:shd w:fill="F7F9FC"/>
+          </w:tcPr>
+          <w:p>
+            <w:pPr>
+              <w:spacing w:before="20" w:after="20"/>
+              <w:jc w:val="center"/>
+            </w:pPr>
+            <w:r>
+              <w:rPr>
+                <w:rFonts w:ascii="Times New Roman" w:hAnsi="Times New Roman"/>
+                <w:b w:val="0"/>
+                <w:i w:val="0"/>
+                <w:color w:val="1E1E1E"/>
+                <w:sz w:val="18"/>
+              </w:rPr>
+              <w:t>0.8787 [0.8451, 0.9091]</w:t>
+            </w:r>
+          </w:p>
+        </w:tc>
+        <w:tc>
+          <w:tcPr>
+            <w:tcW w:type="dxa" w:w="1440"/>
+            <w:vAlign w:val="center"/>
+            <w:tcMar>
+              <w:top w:w="120" w:type="dxa"/>
+              <w:bottom w:w="120" w:type="dxa"/>
+              <w:left w:w="140" w:type="dxa"/>
+              <w:right w:w="140" w:type="dxa"/>
+            </w:tcMar>
+            <w:shd w:fill="F7F9FC"/>
+          </w:tcPr>
+          <w:p>
+            <w:pPr>
+              <w:spacing w:before="20" w:after="20"/>
+              <w:jc w:val="center"/>
+            </w:pPr>
+            <w:r>
+              <w:rPr>
+                <w:rFonts w:ascii="Times New Roman" w:hAnsi="Times New Roman"/>
+                <w:b w:val="0"/>
+                <w:i w:val="0"/>
+                <w:color w:val="1E1E1E"/>
+                <w:sz w:val="18"/>
+              </w:rPr>
+              <w:t>0.2691 [0.2200, 0.3164]</w:t>
+            </w:r>
+          </w:p>
+        </w:tc>
+        <w:tc>
+          <w:tcPr>
+            <w:tcW w:type="dxa" w:w="1440"/>
+            <w:vAlign w:val="center"/>
+            <w:tcMar>
+              <w:top w:w="120" w:type="dxa"/>
+              <w:bottom w:w="120" w:type="dxa"/>
+              <w:left w:w="140" w:type="dxa"/>
+              <w:right w:w="140" w:type="dxa"/>
+            </w:tcMar>
+            <w:shd w:fill="F7F9FC"/>
+          </w:tcPr>
+          <w:p>
+            <w:pPr>
+              <w:spacing w:before="20" w:after="20"/>
+              <w:jc w:val="center"/>
+            </w:pPr>
+            <w:r>
+              <w:rPr>
+                <w:rFonts w:ascii="Times New Roman" w:hAnsi="Times New Roman"/>
+                <w:b w:val="0"/>
+                <w:i w:val="0"/>
+                <w:color w:val="1E1E1E"/>
+                <w:sz w:val="18"/>
+              </w:rPr>
+              <w:t>4.55% [2.73%, 6.36%]</w:t>
+            </w:r>
+          </w:p>
+        </w:tc>
+        <w:tc>
+          <w:tcPr>
+            <w:tcW w:type="dxa" w:w="1440"/>
+            <w:vAlign w:val="center"/>
+            <w:tcMar>
+              <w:top w:w="120" w:type="dxa"/>
+              <w:bottom w:w="120" w:type="dxa"/>
+              <w:left w:w="140" w:type="dxa"/>
+              <w:right w:w="140" w:type="dxa"/>
+            </w:tcMar>
+            <w:shd w:fill="F7F9FC"/>
+          </w:tcPr>
+          <w:p>
+            <w:pPr>
+              <w:spacing w:before="20" w:after="20"/>
+              <w:jc w:val="center"/>
+            </w:pPr>
+            <w:r>
+              <w:rPr>
+                <w:rFonts w:ascii="Times New Roman" w:hAnsi="Times New Roman"/>
+                <w:b w:val="0"/>
+                <w:i w:val="0"/>
+                <w:color w:val="1E1E1E"/>
+                <w:sz w:val="18"/>
+              </w:rPr>
+              <w:t>0.3721 [0.2432, 0.5056]</w:t>
+            </w:r>
+          </w:p>
+        </w:tc>
+        <w:tc>
+          <w:tcPr>
+            <w:tcW w:type="dxa" w:w="1440"/>
+            <w:vAlign w:val="center"/>
+            <w:tcMar>
+              <w:top w:w="120" w:type="dxa"/>
+              <w:bottom w:w="120" w:type="dxa"/>
+              <w:left w:w="140" w:type="dxa"/>
+              <w:right w:w="140" w:type="dxa"/>
+            </w:tcMar>
+            <w:shd w:fill="F7F9FC"/>
+          </w:tcPr>
+          <w:p>
+            <w:pPr>
+              <w:spacing w:before="20" w:after="20"/>
+              <w:jc w:val="center"/>
+            </w:pPr>
+            <w:r>
+              <w:rPr>
+                <w:rFonts w:ascii="Times New Roman" w:hAnsi="Times New Roman"/>
+                <w:b/>
+                <w:i w:val="0"/>
+                <w:color w:val="1E1E1E"/>
+                <w:sz w:val="18"/>
+              </w:rPr>
+              <w:t>0.5778</w:t>
+            </w:r>
+            <w:r>
+              <w:rPr>
+                <w:rFonts w:ascii="Times New Roman" w:hAnsi="Times New Roman"/>
+                <w:b w:val="0"/>
+                <w:i w:val="0"/>
+                <w:color w:val="1E1E1E"/>
+                <w:sz w:val="18"/>
+              </w:rPr>
+              <w:t xml:space="preserve"> [0.4444, 0.6875]</w:t>
+            </w:r>
+          </w:p>
+        </w:tc>
+      </w:tr>
+    </w:tbl>
+    <w:p>
+      <w:pPr>
+        <w:spacing w:before="40" w:after="120"/>
+      </w:pPr>
+    </w:p>
+    <w:p>
+      <w:pPr>
+        <w:keepNext/>
+        <w:spacing w:before="120" w:after="40"/>
+      </w:pPr>
+      <w:r>
+        <w:rPr>
+          <w:rFonts w:ascii="Times New Roman" w:hAnsi="Times New Roman"/>
+          <w:b/>
+          <w:color w:val="323232"/>
+          <w:sz w:val="20"/>
+        </w:rPr>
+        <w:t>1) Gains from Regularization and Ensembling</w:t>
+      </w:r>
+    </w:p>
+    <w:p>
+      <w:pPr>
+        <w:spacing w:before="20" w:after="40" w:line="276" w:lineRule="auto"/>
+        <w:ind w:left="432"/>
+      </w:pPr>
+      <w:r>
+        <w:rPr>
+          <w:rFonts w:ascii="Times New Roman" w:hAnsi="Times New Roman"/>
+          <w:b/>
+          <w:sz w:val="20"/>
+        </w:rPr>
+        <w:t xml:space="preserve">1. </w:t>
+      </w:r>
+      <w:r>
+        <w:rPr>
+          <w:rFonts w:ascii="Times New Roman" w:hAnsi="Times New Roman"/>
+          <w:b/>
+          <w:i w:val="0"/>
+          <w:color w:val="1E1E1E"/>
+          <w:sz w:val="20"/>
+        </w:rPr>
+        <w:t>Single Model Improvements:</w:t>
+      </w:r>
       <w:r>
         <w:rPr>
           <w:rFonts w:ascii="Times New Roman" w:hAnsi="Times New Roman"/>
@@ -9260,7 +10997,1356 @@
           <w:color w:val="1E1E1E"/>
           <w:sz w:val="20"/>
         </w:rPr>
-        <w:t>Standard softmax cross-entropy is agnostic to this asymmetry because its loss gradient does not factor in label distance. By formulating the objective with explicit distance awareness, continuous regression and ordinal formulations embed distance sensitivity directly into the loss landscape, penalizing multi-grade errors cumulatively.</w:t>
+        <w:t xml:space="preserve"> Integrating label smoothing ($\alpha = 0.08$) and safe-light geometric jitter directly improved raw accuracy from $80.18\%$ to </w:t>
+      </w:r>
+      <w:r>
+        <w:rPr>
+          <w:rFonts w:ascii="Times New Roman" w:hAnsi="Times New Roman"/>
+          <w:b/>
+          <w:i w:val="0"/>
+          <w:color w:val="1E1E1E"/>
+          <w:sz w:val="20"/>
+        </w:rPr>
+        <w:t>$82.00\%$</w:t>
+      </w:r>
+      <w:r>
+        <w:rPr>
+          <w:rFonts w:ascii="Times New Roman" w:hAnsi="Times New Roman"/>
+          <w:b w:val="0"/>
+          <w:i w:val="0"/>
+          <w:color w:val="1E1E1E"/>
+          <w:sz w:val="20"/>
+        </w:rPr>
+        <w:t xml:space="preserve"> ($+1.82\%$ absolute gain), while simultaneously reducing MAE from $0.2673$ to $0.2473$ and increasing Grade 3 Severe F1 from $0.3810$ to $0.4828$.</w:t>
+      </w:r>
+    </w:p>
+    <w:p>
+      <w:pPr>
+        <w:spacing w:before="20" w:after="40" w:line="276" w:lineRule="auto"/>
+        <w:ind w:left="432"/>
+      </w:pPr>
+      <w:r>
+        <w:rPr>
+          <w:rFonts w:ascii="Times New Roman" w:hAnsi="Times New Roman"/>
+          <w:b/>
+          <w:sz w:val="20"/>
+        </w:rPr>
+        <w:t xml:space="preserve">2. </w:t>
+      </w:r>
+      <w:r>
+        <w:rPr>
+          <w:rFonts w:ascii="Times New Roman" w:hAnsi="Times New Roman"/>
+          <w:b/>
+          <w:i w:val="0"/>
+          <w:color w:val="1E1E1E"/>
+          <w:sz w:val="20"/>
+        </w:rPr>
+        <w:t>Multi-Seed Ensembling Peak:</w:t>
+      </w:r>
+      <w:r>
+        <w:rPr>
+          <w:rFonts w:ascii="Times New Roman" w:hAnsi="Times New Roman"/>
+          <w:b w:val="0"/>
+          <w:i w:val="0"/>
+          <w:color w:val="1E1E1E"/>
+          <w:sz w:val="20"/>
+        </w:rPr>
+        <w:t xml:space="preserve"> Combining the three independently trained seeds ($42, 43, 44$) with 4-way flip TTA achieved an overall classification accuracy of </w:t>
+      </w:r>
+      <w:r>
+        <w:rPr>
+          <w:rFonts w:ascii="Times New Roman" w:hAnsi="Times New Roman"/>
+          <w:b/>
+          <w:i w:val="0"/>
+          <w:color w:val="1E1E1E"/>
+          <w:sz w:val="20"/>
+        </w:rPr>
+        <w:t>$83.82\%$ [80.73%, 86.73%]</w:t>
+      </w:r>
+      <w:r>
+        <w:rPr>
+          <w:rFonts w:ascii="Times New Roman" w:hAnsi="Times New Roman"/>
+          <w:b w:val="0"/>
+          <w:i w:val="0"/>
+          <w:color w:val="1E1E1E"/>
+          <w:sz w:val="20"/>
+        </w:rPr>
+        <w:t xml:space="preserve">, an absolute increase of </w:t>
+      </w:r>
+      <w:r>
+        <w:rPr>
+          <w:rFonts w:ascii="Times New Roman" w:hAnsi="Times New Roman"/>
+          <w:b/>
+          <w:i w:val="0"/>
+          <w:color w:val="1E1E1E"/>
+          <w:sz w:val="20"/>
+        </w:rPr>
+        <w:t>$+3.64\%$</w:t>
+      </w:r>
+      <w:r>
+        <w:rPr>
+          <w:rFonts w:ascii="Times New Roman" w:hAnsi="Times New Roman"/>
+          <w:b w:val="0"/>
+          <w:i w:val="0"/>
+          <w:color w:val="1E1E1E"/>
+          <w:sz w:val="20"/>
+        </w:rPr>
+        <w:t xml:space="preserve"> over the original Softmax baseline ($80.18\%$). Simultaneously, QWK reached </w:t>
+      </w:r>
+      <w:r>
+        <w:rPr>
+          <w:rFonts w:ascii="Times New Roman" w:hAnsi="Times New Roman"/>
+          <w:b/>
+          <w:i w:val="0"/>
+          <w:color w:val="1E1E1E"/>
+          <w:sz w:val="20"/>
+        </w:rPr>
+        <w:t>$0.8859$</w:t>
+      </w:r>
+      <w:r>
+        <w:rPr>
+          <w:rFonts w:ascii="Times New Roman" w:hAnsi="Times New Roman"/>
+          <w:b w:val="0"/>
+          <w:i w:val="0"/>
+          <w:color w:val="1E1E1E"/>
+          <w:sz w:val="20"/>
+        </w:rPr>
+        <w:t xml:space="preserve"> (surpassing both Variant A's $0.8724$ and Variant C's $0.8788$), MAE dropped to a project-best </w:t>
+      </w:r>
+      <w:r>
+        <w:rPr>
+          <w:rFonts w:ascii="Times New Roman" w:hAnsi="Times New Roman"/>
+          <w:b/>
+          <w:i w:val="0"/>
+          <w:color w:val="1E1E1E"/>
+          <w:sz w:val="20"/>
+        </w:rPr>
+        <w:t>$0.2200$</w:t>
+      </w:r>
+      <w:r>
+        <w:rPr>
+          <w:rFonts w:ascii="Times New Roman" w:hAnsi="Times New Roman"/>
+          <w:b w:val="0"/>
+          <w:i w:val="0"/>
+          <w:color w:val="1E1E1E"/>
+          <w:sz w:val="20"/>
+        </w:rPr>
+        <w:t xml:space="preserve">, and catastrophic multi-grade triage errors ($d \ge 2$) were reduced from $5.64\%$ down to </w:t>
+      </w:r>
+      <w:r>
+        <w:rPr>
+          <w:rFonts w:ascii="Times New Roman" w:hAnsi="Times New Roman"/>
+          <w:b/>
+          <w:i w:val="0"/>
+          <w:color w:val="1E1E1E"/>
+          <w:sz w:val="20"/>
+        </w:rPr>
+        <w:t>$4.36\%$</w:t>
+      </w:r>
+      <w:r>
+        <w:rPr>
+          <w:rFonts w:ascii="Times New Roman" w:hAnsi="Times New Roman"/>
+          <w:b w:val="0"/>
+          <w:i w:val="0"/>
+          <w:color w:val="1E1E1E"/>
+          <w:sz w:val="20"/>
+        </w:rPr>
+        <w:t>.</w:t>
+      </w:r>
+    </w:p>
+    <w:p>
+      <w:pPr>
+        <w:keepNext/>
+        <w:spacing w:before="120" w:after="40"/>
+      </w:pPr>
+      <w:r>
+        <w:rPr>
+          <w:rFonts w:ascii="Times New Roman" w:hAnsi="Times New Roman"/>
+          <w:b/>
+          <w:color w:val="323232"/>
+          <w:sz w:val="20"/>
+        </w:rPr>
+        <w:t>2) Post-Hoc Logit Adjustment $\tau$ Sweep Analysis</w:t>
+      </w:r>
+    </w:p>
+    <w:p>
+      <w:pPr>
+        <w:spacing w:before="0" w:after="90" w:line="276" w:lineRule="auto"/>
+        <w:jc w:val="both"/>
+      </w:pPr>
+      <w:r>
+        <w:rPr>
+          <w:rFonts w:ascii="Times New Roman" w:hAnsi="Times New Roman"/>
+          <w:b w:val="0"/>
+          <w:i w:val="0"/>
+          <w:color w:val="1E1E1E"/>
+          <w:sz w:val="20"/>
+        </w:rPr>
+        <w:t>To empirically map the trade-off between raw classification accuracy and minority-class sensitivity without altering model weights, Table IV documents the evaluation of the 3-Seed Ensemble across $\tau \in \{0.0, 0.5, 1.0, 1.5\}$.</w:t>
+      </w:r>
+    </w:p>
+    <w:p>
+      <w:pPr>
+        <w:keepNext/>
+        <w:spacing w:before="120" w:after="40"/>
+      </w:pPr>
+      <w:r>
+        <w:rPr>
+          <w:rFonts w:ascii="Times New Roman" w:hAnsi="Times New Roman"/>
+          <w:b/>
+          <w:color w:val="323232"/>
+          <w:sz w:val="20"/>
+        </w:rPr>
+        <w:t>TABLE IV: Post-Hoc Logit Adjustment Temperature Sweep on 3-Seed Ensemble</w:t>
+      </w:r>
+    </w:p>
+    <w:tbl>
+      <w:tblPr>
+        <w:tblW w:type="auto" w:w="0"/>
+        <w:jc w:val="center"/>
+        <w:tblLook w:firstColumn="1" w:firstRow="1" w:lastColumn="0" w:lastRow="0" w:noHBand="0" w:noVBand="1" w:val="04A0"/>
+        <w:tblBorders>
+          <w:top w:val="single" w:sz="6" w:space="0" w:color="CCCCCC"/>
+          <w:bottom w:val="single" w:sz="8" w:space="0" w:color="333333"/>
+          <w:insideH w:val="single" w:sz="4" w:space="0" w:color="E0E0E0"/>
+          <w:insideV w:val="none"/>
+          <w:left w:val="none"/>
+          <w:right w:val="none"/>
+        </w:tblBorders>
+      </w:tblPr>
+      <w:tblGrid>
+        <w:gridCol w:w="1680"/>
+        <w:gridCol w:w="1680"/>
+        <w:gridCol w:w="1680"/>
+        <w:gridCol w:w="1680"/>
+        <w:gridCol w:w="1680"/>
+        <w:gridCol w:w="1680"/>
+      </w:tblGrid>
+      <w:tr>
+        <w:tc>
+          <w:tcPr>
+            <w:tcW w:type="dxa" w:w="1680"/>
+            <w:vAlign w:val="center"/>
+            <w:tcMar>
+              <w:top w:w="120" w:type="dxa"/>
+              <w:bottom w:w="120" w:type="dxa"/>
+              <w:left w:w="140" w:type="dxa"/>
+              <w:right w:w="140" w:type="dxa"/>
+            </w:tcMar>
+            <w:shd w:fill="2B5C8F"/>
+          </w:tcPr>
+          <w:p>
+            <w:pPr>
+              <w:spacing w:before="20" w:after="20"/>
+              <w:jc w:val="center"/>
+            </w:pPr>
+            <w:r>
+              <w:rPr>
+                <w:rFonts w:ascii="Times New Roman" w:hAnsi="Times New Roman"/>
+                <w:b/>
+                <w:i w:val="0"/>
+                <w:color w:val="FFFFFF"/>
+                <w:sz w:val="18"/>
+              </w:rPr>
+              <w:t>Logit Adjustment $\tau$</w:t>
+            </w:r>
+          </w:p>
+        </w:tc>
+        <w:tc>
+          <w:tcPr>
+            <w:tcW w:type="dxa" w:w="1680"/>
+            <w:vAlign w:val="center"/>
+            <w:tcMar>
+              <w:top w:w="120" w:type="dxa"/>
+              <w:bottom w:w="120" w:type="dxa"/>
+              <w:left w:w="140" w:type="dxa"/>
+              <w:right w:w="140" w:type="dxa"/>
+            </w:tcMar>
+            <w:shd w:fill="2B5C8F"/>
+          </w:tcPr>
+          <w:p>
+            <w:pPr>
+              <w:spacing w:before="20" w:after="20"/>
+              <w:jc w:val="center"/>
+            </w:pPr>
+            <w:r>
+              <w:rPr>
+                <w:rFonts w:ascii="Times New Roman" w:hAnsi="Times New Roman"/>
+                <w:b/>
+                <w:i w:val="0"/>
+                <w:color w:val="FFFFFF"/>
+                <w:sz w:val="18"/>
+              </w:rPr>
+              <w:t>Accuracy</w:t>
+            </w:r>
+          </w:p>
+        </w:tc>
+        <w:tc>
+          <w:tcPr>
+            <w:tcW w:type="dxa" w:w="1680"/>
+            <w:vAlign w:val="center"/>
+            <w:tcMar>
+              <w:top w:w="120" w:type="dxa"/>
+              <w:bottom w:w="120" w:type="dxa"/>
+              <w:left w:w="140" w:type="dxa"/>
+              <w:right w:w="140" w:type="dxa"/>
+            </w:tcMar>
+            <w:shd w:fill="2B5C8F"/>
+          </w:tcPr>
+          <w:p>
+            <w:pPr>
+              <w:spacing w:before="20" w:after="20"/>
+              <w:jc w:val="center"/>
+            </w:pPr>
+            <w:r>
+              <w:rPr>
+                <w:rFonts w:ascii="Times New Roman" w:hAnsi="Times New Roman"/>
+                <w:b/>
+                <w:i w:val="0"/>
+                <w:color w:val="FFFFFF"/>
+                <w:sz w:val="18"/>
+              </w:rPr>
+              <w:t>QWK</w:t>
+            </w:r>
+          </w:p>
+        </w:tc>
+        <w:tc>
+          <w:tcPr>
+            <w:tcW w:type="dxa" w:w="1680"/>
+            <w:vAlign w:val="center"/>
+            <w:tcMar>
+              <w:top w:w="120" w:type="dxa"/>
+              <w:bottom w:w="120" w:type="dxa"/>
+              <w:left w:w="140" w:type="dxa"/>
+              <w:right w:w="140" w:type="dxa"/>
+            </w:tcMar>
+            <w:shd w:fill="2B5C8F"/>
+          </w:tcPr>
+          <w:p>
+            <w:pPr>
+              <w:spacing w:before="20" w:after="20"/>
+              <w:jc w:val="center"/>
+            </w:pPr>
+            <w:r>
+              <w:rPr>
+                <w:rFonts w:ascii="Times New Roman" w:hAnsi="Times New Roman"/>
+                <w:b/>
+                <w:i w:val="0"/>
+                <w:color w:val="FFFFFF"/>
+                <w:sz w:val="18"/>
+              </w:rPr>
+              <w:t>MAE</w:t>
+            </w:r>
+          </w:p>
+        </w:tc>
+        <w:tc>
+          <w:tcPr>
+            <w:tcW w:type="dxa" w:w="1680"/>
+            <w:vAlign w:val="center"/>
+            <w:tcMar>
+              <w:top w:w="120" w:type="dxa"/>
+              <w:bottom w:w="120" w:type="dxa"/>
+              <w:left w:w="140" w:type="dxa"/>
+              <w:right w:w="140" w:type="dxa"/>
+            </w:tcMar>
+            <w:shd w:fill="2B5C8F"/>
+          </w:tcPr>
+          <w:p>
+            <w:pPr>
+              <w:spacing w:before="20" w:after="20"/>
+              <w:jc w:val="center"/>
+            </w:pPr>
+            <w:r>
+              <w:rPr>
+                <w:rFonts w:ascii="Times New Roman" w:hAnsi="Times New Roman"/>
+                <w:b/>
+                <w:i w:val="0"/>
+                <w:color w:val="FFFFFF"/>
+                <w:sz w:val="18"/>
+              </w:rPr>
+              <w:t>Severe Recall (Grade 3)</w:t>
+            </w:r>
+          </w:p>
+        </w:tc>
+        <w:tc>
+          <w:tcPr>
+            <w:tcW w:type="dxa" w:w="1680"/>
+            <w:vAlign w:val="center"/>
+            <w:tcMar>
+              <w:top w:w="120" w:type="dxa"/>
+              <w:bottom w:w="120" w:type="dxa"/>
+              <w:left w:w="140" w:type="dxa"/>
+              <w:right w:w="140" w:type="dxa"/>
+            </w:tcMar>
+            <w:shd w:fill="2B5C8F"/>
+          </w:tcPr>
+          <w:p>
+            <w:pPr>
+              <w:spacing w:before="20" w:after="20"/>
+              <w:jc w:val="center"/>
+            </w:pPr>
+            <w:r>
+              <w:rPr>
+                <w:rFonts w:ascii="Times New Roman" w:hAnsi="Times New Roman"/>
+                <w:b/>
+                <w:i w:val="0"/>
+                <w:color w:val="FFFFFF"/>
+                <w:sz w:val="18"/>
+              </w:rPr>
+              <w:t>PDR Recall (Grade 4)</w:t>
+            </w:r>
+          </w:p>
+        </w:tc>
+      </w:tr>
+      <w:tr>
+        <w:tc>
+          <w:tcPr>
+            <w:tcW w:type="dxa" w:w="1680"/>
+            <w:vAlign w:val="center"/>
+            <w:tcMar>
+              <w:top w:w="120" w:type="dxa"/>
+              <w:bottom w:w="120" w:type="dxa"/>
+              <w:left w:w="140" w:type="dxa"/>
+              <w:right w:w="140" w:type="dxa"/>
+            </w:tcMar>
+            <w:shd w:fill="F7F9FC"/>
+          </w:tcPr>
+          <w:p>
+            <w:pPr>
+              <w:spacing w:before="20" w:after="20"/>
+              <w:jc w:val="left"/>
+            </w:pPr>
+            <w:r>
+              <w:rPr>
+                <w:rFonts w:ascii="Times New Roman" w:hAnsi="Times New Roman"/>
+                <w:b/>
+                <w:i w:val="0"/>
+                <w:color w:val="1E1E1E"/>
+                <w:sz w:val="18"/>
+              </w:rPr>
+              <w:t>0.0 (Unadjusted, Raw Acc Focus)</w:t>
+            </w:r>
+          </w:p>
+        </w:tc>
+        <w:tc>
+          <w:tcPr>
+            <w:tcW w:type="dxa" w:w="1680"/>
+            <w:vAlign w:val="center"/>
+            <w:tcMar>
+              <w:top w:w="120" w:type="dxa"/>
+              <w:bottom w:w="120" w:type="dxa"/>
+              <w:left w:w="140" w:type="dxa"/>
+              <w:right w:w="140" w:type="dxa"/>
+            </w:tcMar>
+            <w:shd w:fill="F7F9FC"/>
+          </w:tcPr>
+          <w:p>
+            <w:pPr>
+              <w:spacing w:before="20" w:after="20"/>
+              <w:jc w:val="center"/>
+            </w:pPr>
+            <w:r>
+              <w:rPr>
+                <w:rFonts w:ascii="Times New Roman" w:hAnsi="Times New Roman"/>
+                <w:b/>
+                <w:i w:val="0"/>
+                <w:color w:val="1E1E1E"/>
+                <w:sz w:val="18"/>
+              </w:rPr>
+              <w:t>83.82%</w:t>
+            </w:r>
+          </w:p>
+        </w:tc>
+        <w:tc>
+          <w:tcPr>
+            <w:tcW w:type="dxa" w:w="1680"/>
+            <w:vAlign w:val="center"/>
+            <w:tcMar>
+              <w:top w:w="120" w:type="dxa"/>
+              <w:bottom w:w="120" w:type="dxa"/>
+              <w:left w:w="140" w:type="dxa"/>
+              <w:right w:w="140" w:type="dxa"/>
+            </w:tcMar>
+            <w:shd w:fill="F7F9FC"/>
+          </w:tcPr>
+          <w:p>
+            <w:pPr>
+              <w:spacing w:before="20" w:after="20"/>
+              <w:jc w:val="center"/>
+            </w:pPr>
+            <w:r>
+              <w:rPr>
+                <w:rFonts w:ascii="Times New Roman" w:hAnsi="Times New Roman"/>
+                <w:b w:val="0"/>
+                <w:i w:val="0"/>
+                <w:color w:val="1E1E1E"/>
+                <w:sz w:val="18"/>
+              </w:rPr>
+              <w:t>0.8859</w:t>
+            </w:r>
+          </w:p>
+        </w:tc>
+        <w:tc>
+          <w:tcPr>
+            <w:tcW w:type="dxa" w:w="1680"/>
+            <w:vAlign w:val="center"/>
+            <w:tcMar>
+              <w:top w:w="120" w:type="dxa"/>
+              <w:bottom w:w="120" w:type="dxa"/>
+              <w:left w:w="140" w:type="dxa"/>
+              <w:right w:w="140" w:type="dxa"/>
+            </w:tcMar>
+            <w:shd w:fill="F7F9FC"/>
+          </w:tcPr>
+          <w:p>
+            <w:pPr>
+              <w:spacing w:before="20" w:after="20"/>
+              <w:jc w:val="center"/>
+            </w:pPr>
+            <w:r>
+              <w:rPr>
+                <w:rFonts w:ascii="Times New Roman" w:hAnsi="Times New Roman"/>
+                <w:b/>
+                <w:i w:val="0"/>
+                <w:color w:val="1E1E1E"/>
+                <w:sz w:val="18"/>
+              </w:rPr>
+              <w:t>0.2200</w:t>
+            </w:r>
+          </w:p>
+        </w:tc>
+        <w:tc>
+          <w:tcPr>
+            <w:tcW w:type="dxa" w:w="1680"/>
+            <w:vAlign w:val="center"/>
+            <w:tcMar>
+              <w:top w:w="120" w:type="dxa"/>
+              <w:bottom w:w="120" w:type="dxa"/>
+              <w:left w:w="140" w:type="dxa"/>
+              <w:right w:w="140" w:type="dxa"/>
+            </w:tcMar>
+            <w:shd w:fill="F7F9FC"/>
+          </w:tcPr>
+          <w:p>
+            <w:pPr>
+              <w:spacing w:before="20" w:after="20"/>
+              <w:jc w:val="center"/>
+            </w:pPr>
+            <w:r>
+              <w:rPr>
+                <w:rFonts w:ascii="Times New Roman" w:hAnsi="Times New Roman"/>
+                <w:b w:val="0"/>
+                <w:i w:val="0"/>
+                <w:color w:val="1E1E1E"/>
+                <w:sz w:val="18"/>
+              </w:rPr>
+              <w:t>44.8%</w:t>
+            </w:r>
+          </w:p>
+        </w:tc>
+        <w:tc>
+          <w:tcPr>
+            <w:tcW w:type="dxa" w:w="1680"/>
+            <w:vAlign w:val="center"/>
+            <w:tcMar>
+              <w:top w:w="120" w:type="dxa"/>
+              <w:bottom w:w="120" w:type="dxa"/>
+              <w:left w:w="140" w:type="dxa"/>
+              <w:right w:w="140" w:type="dxa"/>
+            </w:tcMar>
+            <w:shd w:fill="F7F9FC"/>
+          </w:tcPr>
+          <w:p>
+            <w:pPr>
+              <w:spacing w:before="20" w:after="20"/>
+              <w:jc w:val="center"/>
+            </w:pPr>
+            <w:r>
+              <w:rPr>
+                <w:rFonts w:ascii="Times New Roman" w:hAnsi="Times New Roman"/>
+                <w:b w:val="0"/>
+                <w:i w:val="0"/>
+                <w:color w:val="1E1E1E"/>
+                <w:sz w:val="18"/>
+              </w:rPr>
+              <w:t>50.0%</w:t>
+            </w:r>
+          </w:p>
+        </w:tc>
+      </w:tr>
+      <w:tr>
+        <w:tc>
+          <w:tcPr>
+            <w:tcW w:type="dxa" w:w="1680"/>
+            <w:vAlign w:val="center"/>
+            <w:tcMar>
+              <w:top w:w="120" w:type="dxa"/>
+              <w:bottom w:w="120" w:type="dxa"/>
+              <w:left w:w="140" w:type="dxa"/>
+              <w:right w:w="140" w:type="dxa"/>
+            </w:tcMar>
+            <w:shd w:fill="FFFFFF"/>
+          </w:tcPr>
+          <w:p>
+            <w:pPr>
+              <w:spacing w:before="20" w:after="20"/>
+              <w:jc w:val="left"/>
+            </w:pPr>
+            <w:r>
+              <w:rPr>
+                <w:rFonts w:ascii="Times New Roman" w:hAnsi="Times New Roman"/>
+                <w:b/>
+                <w:i w:val="0"/>
+                <w:color w:val="1E1E1E"/>
+                <w:sz w:val="18"/>
+              </w:rPr>
+              <w:t>0.5 (Balanced Trade-off)</w:t>
+            </w:r>
+          </w:p>
+        </w:tc>
+        <w:tc>
+          <w:tcPr>
+            <w:tcW w:type="dxa" w:w="1680"/>
+            <w:vAlign w:val="center"/>
+            <w:tcMar>
+              <w:top w:w="120" w:type="dxa"/>
+              <w:bottom w:w="120" w:type="dxa"/>
+              <w:left w:w="140" w:type="dxa"/>
+              <w:right w:w="140" w:type="dxa"/>
+            </w:tcMar>
+            <w:shd w:fill="FFFFFF"/>
+          </w:tcPr>
+          <w:p>
+            <w:pPr>
+              <w:spacing w:before="20" w:after="20"/>
+              <w:jc w:val="center"/>
+            </w:pPr>
+            <w:r>
+              <w:rPr>
+                <w:rFonts w:ascii="Times New Roman" w:hAnsi="Times New Roman"/>
+                <w:b w:val="0"/>
+                <w:i w:val="0"/>
+                <w:color w:val="1E1E1E"/>
+                <w:sz w:val="18"/>
+              </w:rPr>
+              <w:t>82.18%</w:t>
+            </w:r>
+          </w:p>
+        </w:tc>
+        <w:tc>
+          <w:tcPr>
+            <w:tcW w:type="dxa" w:w="1680"/>
+            <w:vAlign w:val="center"/>
+            <w:tcMar>
+              <w:top w:w="120" w:type="dxa"/>
+              <w:bottom w:w="120" w:type="dxa"/>
+              <w:left w:w="140" w:type="dxa"/>
+              <w:right w:w="140" w:type="dxa"/>
+            </w:tcMar>
+            <w:shd w:fill="FFFFFF"/>
+          </w:tcPr>
+          <w:p>
+            <w:pPr>
+              <w:spacing w:before="20" w:after="20"/>
+              <w:jc w:val="center"/>
+            </w:pPr>
+            <w:r>
+              <w:rPr>
+                <w:rFonts w:ascii="Times New Roman" w:hAnsi="Times New Roman"/>
+                <w:b/>
+                <w:i w:val="0"/>
+                <w:color w:val="1E1E1E"/>
+                <w:sz w:val="18"/>
+              </w:rPr>
+              <w:t>0.8929</w:t>
+            </w:r>
+          </w:p>
+        </w:tc>
+        <w:tc>
+          <w:tcPr>
+            <w:tcW w:type="dxa" w:w="1680"/>
+            <w:vAlign w:val="center"/>
+            <w:tcMar>
+              <w:top w:w="120" w:type="dxa"/>
+              <w:bottom w:w="120" w:type="dxa"/>
+              <w:left w:w="140" w:type="dxa"/>
+              <w:right w:w="140" w:type="dxa"/>
+            </w:tcMar>
+            <w:shd w:fill="FFFFFF"/>
+          </w:tcPr>
+          <w:p>
+            <w:pPr>
+              <w:spacing w:before="20" w:after="20"/>
+              <w:jc w:val="center"/>
+            </w:pPr>
+            <w:r>
+              <w:rPr>
+                <w:rFonts w:ascii="Times New Roman" w:hAnsi="Times New Roman"/>
+                <w:b w:val="0"/>
+                <w:i w:val="0"/>
+                <w:color w:val="1E1E1E"/>
+                <w:sz w:val="18"/>
+              </w:rPr>
+              <w:t>0.2291</w:t>
+            </w:r>
+          </w:p>
+        </w:tc>
+        <w:tc>
+          <w:tcPr>
+            <w:tcW w:type="dxa" w:w="1680"/>
+            <w:vAlign w:val="center"/>
+            <w:tcMar>
+              <w:top w:w="120" w:type="dxa"/>
+              <w:bottom w:w="120" w:type="dxa"/>
+              <w:left w:w="140" w:type="dxa"/>
+              <w:right w:w="140" w:type="dxa"/>
+            </w:tcMar>
+            <w:shd w:fill="FFFFFF"/>
+          </w:tcPr>
+          <w:p>
+            <w:pPr>
+              <w:spacing w:before="20" w:after="20"/>
+              <w:jc w:val="center"/>
+            </w:pPr>
+            <w:r>
+              <w:rPr>
+                <w:rFonts w:ascii="Times New Roman" w:hAnsi="Times New Roman"/>
+                <w:b w:val="0"/>
+                <w:i w:val="0"/>
+                <w:color w:val="1E1E1E"/>
+                <w:sz w:val="18"/>
+              </w:rPr>
+              <w:t>51.7%</w:t>
+            </w:r>
+          </w:p>
+        </w:tc>
+        <w:tc>
+          <w:tcPr>
+            <w:tcW w:type="dxa" w:w="1680"/>
+            <w:vAlign w:val="center"/>
+            <w:tcMar>
+              <w:top w:w="120" w:type="dxa"/>
+              <w:bottom w:w="120" w:type="dxa"/>
+              <w:left w:w="140" w:type="dxa"/>
+              <w:right w:w="140" w:type="dxa"/>
+            </w:tcMar>
+            <w:shd w:fill="FFFFFF"/>
+          </w:tcPr>
+          <w:p>
+            <w:pPr>
+              <w:spacing w:before="20" w:after="20"/>
+              <w:jc w:val="center"/>
+            </w:pPr>
+            <w:r>
+              <w:rPr>
+                <w:rFonts w:ascii="Times New Roman" w:hAnsi="Times New Roman"/>
+                <w:b w:val="0"/>
+                <w:i w:val="0"/>
+                <w:color w:val="1E1E1E"/>
+                <w:sz w:val="18"/>
+              </w:rPr>
+              <w:t>56.8%</w:t>
+            </w:r>
+          </w:p>
+        </w:tc>
+      </w:tr>
+      <w:tr>
+        <w:tc>
+          <w:tcPr>
+            <w:tcW w:type="dxa" w:w="1680"/>
+            <w:vAlign w:val="center"/>
+            <w:tcMar>
+              <w:top w:w="120" w:type="dxa"/>
+              <w:bottom w:w="120" w:type="dxa"/>
+              <w:left w:w="140" w:type="dxa"/>
+              <w:right w:w="140" w:type="dxa"/>
+            </w:tcMar>
+            <w:shd w:fill="F7F9FC"/>
+          </w:tcPr>
+          <w:p>
+            <w:pPr>
+              <w:spacing w:before="20" w:after="20"/>
+              <w:jc w:val="left"/>
+            </w:pPr>
+            <w:r>
+              <w:rPr>
+                <w:rFonts w:ascii="Times New Roman" w:hAnsi="Times New Roman"/>
+                <w:b/>
+                <w:i w:val="0"/>
+                <w:color w:val="1E1E1E"/>
+                <w:sz w:val="18"/>
+              </w:rPr>
+              <w:t>1.0 (Standard Prior Adjustment)</w:t>
+            </w:r>
+          </w:p>
+        </w:tc>
+        <w:tc>
+          <w:tcPr>
+            <w:tcW w:type="dxa" w:w="1680"/>
+            <w:vAlign w:val="center"/>
+            <w:tcMar>
+              <w:top w:w="120" w:type="dxa"/>
+              <w:bottom w:w="120" w:type="dxa"/>
+              <w:left w:w="140" w:type="dxa"/>
+              <w:right w:w="140" w:type="dxa"/>
+            </w:tcMar>
+            <w:shd w:fill="F7F9FC"/>
+          </w:tcPr>
+          <w:p>
+            <w:pPr>
+              <w:spacing w:before="20" w:after="20"/>
+              <w:jc w:val="center"/>
+            </w:pPr>
+            <w:r>
+              <w:rPr>
+                <w:rFonts w:ascii="Times New Roman" w:hAnsi="Times New Roman"/>
+                <w:b w:val="0"/>
+                <w:i w:val="0"/>
+                <w:color w:val="1E1E1E"/>
+                <w:sz w:val="18"/>
+              </w:rPr>
+              <w:t>79.27%</w:t>
+            </w:r>
+          </w:p>
+        </w:tc>
+        <w:tc>
+          <w:tcPr>
+            <w:tcW w:type="dxa" w:w="1680"/>
+            <w:vAlign w:val="center"/>
+            <w:tcMar>
+              <w:top w:w="120" w:type="dxa"/>
+              <w:bottom w:w="120" w:type="dxa"/>
+              <w:left w:w="140" w:type="dxa"/>
+              <w:right w:w="140" w:type="dxa"/>
+            </w:tcMar>
+            <w:shd w:fill="F7F9FC"/>
+          </w:tcPr>
+          <w:p>
+            <w:pPr>
+              <w:spacing w:before="20" w:after="20"/>
+              <w:jc w:val="center"/>
+            </w:pPr>
+            <w:r>
+              <w:rPr>
+                <w:rFonts w:ascii="Times New Roman" w:hAnsi="Times New Roman"/>
+                <w:b w:val="0"/>
+                <w:i w:val="0"/>
+                <w:color w:val="1E1E1E"/>
+                <w:sz w:val="18"/>
+              </w:rPr>
+              <w:t>0.8787</w:t>
+            </w:r>
+          </w:p>
+        </w:tc>
+        <w:tc>
+          <w:tcPr>
+            <w:tcW w:type="dxa" w:w="1680"/>
+            <w:vAlign w:val="center"/>
+            <w:tcMar>
+              <w:top w:w="120" w:type="dxa"/>
+              <w:bottom w:w="120" w:type="dxa"/>
+              <w:left w:w="140" w:type="dxa"/>
+              <w:right w:w="140" w:type="dxa"/>
+            </w:tcMar>
+            <w:shd w:fill="F7F9FC"/>
+          </w:tcPr>
+          <w:p>
+            <w:pPr>
+              <w:spacing w:before="20" w:after="20"/>
+              <w:jc w:val="center"/>
+            </w:pPr>
+            <w:r>
+              <w:rPr>
+                <w:rFonts w:ascii="Times New Roman" w:hAnsi="Times New Roman"/>
+                <w:b w:val="0"/>
+                <w:i w:val="0"/>
+                <w:color w:val="1E1E1E"/>
+                <w:sz w:val="18"/>
+              </w:rPr>
+              <w:t>0.2691</w:t>
+            </w:r>
+          </w:p>
+        </w:tc>
+        <w:tc>
+          <w:tcPr>
+            <w:tcW w:type="dxa" w:w="1680"/>
+            <w:vAlign w:val="center"/>
+            <w:tcMar>
+              <w:top w:w="120" w:type="dxa"/>
+              <w:bottom w:w="120" w:type="dxa"/>
+              <w:left w:w="140" w:type="dxa"/>
+              <w:right w:w="140" w:type="dxa"/>
+            </w:tcMar>
+            <w:shd w:fill="F7F9FC"/>
+          </w:tcPr>
+          <w:p>
+            <w:pPr>
+              <w:spacing w:before="20" w:after="20"/>
+              <w:jc w:val="center"/>
+            </w:pPr>
+            <w:r>
+              <w:rPr>
+                <w:rFonts w:ascii="Times New Roman" w:hAnsi="Times New Roman"/>
+                <w:b w:val="0"/>
+                <w:i w:val="0"/>
+                <w:color w:val="1E1E1E"/>
+                <w:sz w:val="18"/>
+              </w:rPr>
+              <w:t>55.2%</w:t>
+            </w:r>
+          </w:p>
+        </w:tc>
+        <w:tc>
+          <w:tcPr>
+            <w:tcW w:type="dxa" w:w="1680"/>
+            <w:vAlign w:val="center"/>
+            <w:tcMar>
+              <w:top w:w="120" w:type="dxa"/>
+              <w:bottom w:w="120" w:type="dxa"/>
+              <w:left w:w="140" w:type="dxa"/>
+              <w:right w:w="140" w:type="dxa"/>
+            </w:tcMar>
+            <w:shd w:fill="F7F9FC"/>
+          </w:tcPr>
+          <w:p>
+            <w:pPr>
+              <w:spacing w:before="20" w:after="20"/>
+              <w:jc w:val="center"/>
+            </w:pPr>
+            <w:r>
+              <w:rPr>
+                <w:rFonts w:ascii="Times New Roman" w:hAnsi="Times New Roman"/>
+                <w:b/>
+                <w:i w:val="0"/>
+                <w:color w:val="1E1E1E"/>
+                <w:sz w:val="18"/>
+              </w:rPr>
+              <w:t>59.1%</w:t>
+            </w:r>
+          </w:p>
+        </w:tc>
+      </w:tr>
+      <w:tr>
+        <w:tc>
+          <w:tcPr>
+            <w:tcW w:type="dxa" w:w="1680"/>
+            <w:vAlign w:val="center"/>
+            <w:tcMar>
+              <w:top w:w="120" w:type="dxa"/>
+              <w:bottom w:w="120" w:type="dxa"/>
+              <w:left w:w="140" w:type="dxa"/>
+              <w:right w:w="140" w:type="dxa"/>
+            </w:tcMar>
+            <w:shd w:fill="FFFFFF"/>
+          </w:tcPr>
+          <w:p>
+            <w:pPr>
+              <w:spacing w:before="20" w:after="20"/>
+              <w:jc w:val="left"/>
+            </w:pPr>
+            <w:r>
+              <w:rPr>
+                <w:rFonts w:ascii="Times New Roman" w:hAnsi="Times New Roman"/>
+                <w:b/>
+                <w:i w:val="0"/>
+                <w:color w:val="1E1E1E"/>
+                <w:sz w:val="18"/>
+              </w:rPr>
+              <w:t>1.5 (Minority-Tail Focus)</w:t>
+            </w:r>
+          </w:p>
+        </w:tc>
+        <w:tc>
+          <w:tcPr>
+            <w:tcW w:type="dxa" w:w="1680"/>
+            <w:vAlign w:val="center"/>
+            <w:tcMar>
+              <w:top w:w="120" w:type="dxa"/>
+              <w:bottom w:w="120" w:type="dxa"/>
+              <w:left w:w="140" w:type="dxa"/>
+              <w:right w:w="140" w:type="dxa"/>
+            </w:tcMar>
+            <w:shd w:fill="FFFFFF"/>
+          </w:tcPr>
+          <w:p>
+            <w:pPr>
+              <w:spacing w:before="20" w:after="20"/>
+              <w:jc w:val="center"/>
+            </w:pPr>
+            <w:r>
+              <w:rPr>
+                <w:rFonts w:ascii="Times New Roman" w:hAnsi="Times New Roman"/>
+                <w:b w:val="0"/>
+                <w:i w:val="0"/>
+                <w:color w:val="1E1E1E"/>
+                <w:sz w:val="18"/>
+              </w:rPr>
+              <w:t>74.91%</w:t>
+            </w:r>
+          </w:p>
+        </w:tc>
+        <w:tc>
+          <w:tcPr>
+            <w:tcW w:type="dxa" w:w="1680"/>
+            <w:vAlign w:val="center"/>
+            <w:tcMar>
+              <w:top w:w="120" w:type="dxa"/>
+              <w:bottom w:w="120" w:type="dxa"/>
+              <w:left w:w="140" w:type="dxa"/>
+              <w:right w:w="140" w:type="dxa"/>
+            </w:tcMar>
+            <w:shd w:fill="FFFFFF"/>
+          </w:tcPr>
+          <w:p>
+            <w:pPr>
+              <w:spacing w:before="20" w:after="20"/>
+              <w:jc w:val="center"/>
+            </w:pPr>
+            <w:r>
+              <w:rPr>
+                <w:rFonts w:ascii="Times New Roman" w:hAnsi="Times New Roman"/>
+                <w:b w:val="0"/>
+                <w:i w:val="0"/>
+                <w:color w:val="1E1E1E"/>
+                <w:sz w:val="18"/>
+              </w:rPr>
+              <w:t>0.8438</w:t>
+            </w:r>
+          </w:p>
+        </w:tc>
+        <w:tc>
+          <w:tcPr>
+            <w:tcW w:type="dxa" w:w="1680"/>
+            <w:vAlign w:val="center"/>
+            <w:tcMar>
+              <w:top w:w="120" w:type="dxa"/>
+              <w:bottom w:w="120" w:type="dxa"/>
+              <w:left w:w="140" w:type="dxa"/>
+              <w:right w:w="140" w:type="dxa"/>
+            </w:tcMar>
+            <w:shd w:fill="FFFFFF"/>
+          </w:tcPr>
+          <w:p>
+            <w:pPr>
+              <w:spacing w:before="20" w:after="20"/>
+              <w:jc w:val="center"/>
+            </w:pPr>
+            <w:r>
+              <w:rPr>
+                <w:rFonts w:ascii="Times New Roman" w:hAnsi="Times New Roman"/>
+                <w:b w:val="0"/>
+                <w:i w:val="0"/>
+                <w:color w:val="1E1E1E"/>
+                <w:sz w:val="18"/>
+              </w:rPr>
+              <w:t>0.3364</w:t>
+            </w:r>
+          </w:p>
+        </w:tc>
+        <w:tc>
+          <w:tcPr>
+            <w:tcW w:type="dxa" w:w="1680"/>
+            <w:vAlign w:val="center"/>
+            <w:tcMar>
+              <w:top w:w="120" w:type="dxa"/>
+              <w:bottom w:w="120" w:type="dxa"/>
+              <w:left w:w="140" w:type="dxa"/>
+              <w:right w:w="140" w:type="dxa"/>
+            </w:tcMar>
+            <w:shd w:fill="FFFFFF"/>
+          </w:tcPr>
+          <w:p>
+            <w:pPr>
+              <w:spacing w:before="20" w:after="20"/>
+              <w:jc w:val="center"/>
+            </w:pPr>
+            <w:r>
+              <w:rPr>
+                <w:rFonts w:ascii="Times New Roman" w:hAnsi="Times New Roman"/>
+                <w:b/>
+                <w:i w:val="0"/>
+                <w:color w:val="1E1E1E"/>
+                <w:sz w:val="18"/>
+              </w:rPr>
+              <w:t>69.0%</w:t>
+            </w:r>
+          </w:p>
+        </w:tc>
+        <w:tc>
+          <w:tcPr>
+            <w:tcW w:type="dxa" w:w="1680"/>
+            <w:vAlign w:val="center"/>
+            <w:tcMar>
+              <w:top w:w="120" w:type="dxa"/>
+              <w:bottom w:w="120" w:type="dxa"/>
+              <w:left w:w="140" w:type="dxa"/>
+              <w:right w:w="140" w:type="dxa"/>
+            </w:tcMar>
+            <w:shd w:fill="FFFFFF"/>
+          </w:tcPr>
+          <w:p>
+            <w:pPr>
+              <w:spacing w:before="20" w:after="20"/>
+              <w:jc w:val="center"/>
+            </w:pPr>
+            <w:r>
+              <w:rPr>
+                <w:rFonts w:ascii="Times New Roman" w:hAnsi="Times New Roman"/>
+                <w:b w:val="0"/>
+                <w:i w:val="0"/>
+                <w:color w:val="1E1E1E"/>
+                <w:sz w:val="18"/>
+              </w:rPr>
+              <w:t>50.0%</w:t>
+            </w:r>
+          </w:p>
+        </w:tc>
+      </w:tr>
+    </w:tbl>
+    <w:p>
+      <w:pPr>
+        <w:spacing w:before="40" w:after="120"/>
+      </w:pPr>
+    </w:p>
+    <w:p>
+      <w:pPr>
+        <w:spacing w:before="0" w:after="90" w:line="276" w:lineRule="auto"/>
+        <w:jc w:val="both"/>
+      </w:pPr>
+      <w:r>
+        <w:rPr>
+          <w:rFonts w:ascii="Times New Roman" w:hAnsi="Times New Roman"/>
+          <w:b w:val="0"/>
+          <w:i w:val="0"/>
+          <w:color w:val="1E1E1E"/>
+          <w:sz w:val="20"/>
+        </w:rPr>
+        <w:t>The sweep quantitatively reveals the mathematical mechanics of logit adjustment:</w:t>
+      </w:r>
+    </w:p>
+    <w:p>
+      <w:pPr>
+        <w:spacing w:before="20" w:after="40" w:line="276" w:lineRule="auto"/>
+        <w:ind w:left="432"/>
+      </w:pPr>
+      <w:r>
+        <w:rPr>
+          <w:rFonts w:ascii="Times New Roman" w:hAnsi="Times New Roman"/>
+          <w:b/>
+          <w:sz w:val="20"/>
+        </w:rPr>
+        <w:t xml:space="preserve">• </w:t>
+      </w:r>
+      <w:r>
+        <w:rPr>
+          <w:rFonts w:ascii="Times New Roman" w:hAnsi="Times New Roman"/>
+          <w:b w:val="0"/>
+          <w:i w:val="0"/>
+          <w:color w:val="1E1E1E"/>
+          <w:sz w:val="20"/>
+        </w:rPr>
+        <w:t>At $\tau = 0.0$, the ensemble operates to maximize overall classification accuracy on the natural dataset distribution ($83.82\%$).</w:t>
+      </w:r>
+    </w:p>
+    <w:p>
+      <w:pPr>
+        <w:spacing w:before="20" w:after="40" w:line="276" w:lineRule="auto"/>
+        <w:ind w:left="432"/>
+      </w:pPr>
+      <w:r>
+        <w:rPr>
+          <w:rFonts w:ascii="Times New Roman" w:hAnsi="Times New Roman"/>
+          <w:b/>
+          <w:sz w:val="20"/>
+        </w:rPr>
+        <w:t xml:space="preserve">• </w:t>
+      </w:r>
+      <w:r>
+        <w:rPr>
+          <w:rFonts w:ascii="Times New Roman" w:hAnsi="Times New Roman"/>
+          <w:b w:val="0"/>
+          <w:i w:val="0"/>
+          <w:color w:val="1E1E1E"/>
+          <w:sz w:val="20"/>
+        </w:rPr>
+        <w:t xml:space="preserve">As $\tau$ increases to $0.5$, Quadratic Weighted Kappa peaks at </w:t>
+      </w:r>
+      <w:r>
+        <w:rPr>
+          <w:rFonts w:ascii="Times New Roman" w:hAnsi="Times New Roman"/>
+          <w:b/>
+          <w:i w:val="0"/>
+          <w:color w:val="1E1E1E"/>
+          <w:sz w:val="20"/>
+        </w:rPr>
+        <w:t>$0.8929$</w:t>
+      </w:r>
+      <w:r>
+        <w:rPr>
+          <w:rFonts w:ascii="Times New Roman" w:hAnsi="Times New Roman"/>
+          <w:b w:val="0"/>
+          <w:i w:val="0"/>
+          <w:color w:val="1E1E1E"/>
+          <w:sz w:val="20"/>
+        </w:rPr>
+        <w:t xml:space="preserve"> (the highest QWK attained in this entire research study), with Severe Recall rising to $51.7\%$ and Proliferative Recall to $56.8\%$, while maintaining an impressive $82.18\%$ accuracy.</w:t>
+      </w:r>
+    </w:p>
+    <w:p>
+      <w:pPr>
+        <w:spacing w:before="20" w:after="40" w:line="276" w:lineRule="auto"/>
+        <w:ind w:left="432"/>
+      </w:pPr>
+      <w:r>
+        <w:rPr>
+          <w:rFonts w:ascii="Times New Roman" w:hAnsi="Times New Roman"/>
+          <w:b/>
+          <w:sz w:val="20"/>
+        </w:rPr>
+        <w:t xml:space="preserve">• </w:t>
+      </w:r>
+      <w:r>
+        <w:rPr>
+          <w:rFonts w:ascii="Times New Roman" w:hAnsi="Times New Roman"/>
+          <w:b w:val="0"/>
+          <w:i w:val="0"/>
+          <w:color w:val="1E1E1E"/>
+          <w:sz w:val="20"/>
+        </w:rPr>
+        <w:t>At $\tau = 1.5$, Severe NPDR Recall rises to $69.0\%$, but overall accuracy is pulled down to $74.91\%$, illustrating that post-hoc logit adjustment provides clinicians with a continuous control dial to select an operating point tailored to local triage priorities.</w:t>
+      </w:r>
+    </w:p>
+    <w:p>
+      <w:pPr>
+        <w:spacing w:before="0" w:after="90" w:line="276" w:lineRule="auto"/>
+        <w:jc w:val="both"/>
+      </w:pPr>
+      <w:r>
+        <w:rPr>
+          <w:rFonts w:ascii="Times New Roman" w:hAnsi="Times New Roman"/>
+          <w:b w:val="0"/>
+          <w:i w:val="0"/>
+          <w:color w:val="1E1E1E"/>
+          <w:sz w:val="20"/>
+        </w:rPr>
+        <w:t>Figure 5 presents the confusion matrices across the four accuracy configurations on the holdout test set.</w:t>
+      </w:r>
+    </w:p>
+    <w:p>
+      <w:pPr>
+        <w:spacing w:before="160" w:after="60"/>
+        <w:jc w:val="center"/>
+      </w:pPr>
+      <w:r>
+        <w:drawing>
+          <wp:inline xmlns:a="http://schemas.openxmlformats.org/drawingml/2006/main" xmlns:pic="http://schemas.openxmlformats.org/drawingml/2006/picture">
+            <wp:extent cx="5029200" cy="1188720"/>
+            <wp:docPr id="5" name="Picture 5"/>
+            <wp:cNvGraphicFramePr>
+              <a:graphicFrameLocks noChangeAspect="1"/>
+            </wp:cNvGraphicFramePr>
+            <a:graphic>
+              <a:graphicData uri="http://schemas.openxmlformats.org/drawingml/2006/picture">
+                <pic:pic>
+                  <pic:nvPicPr>
+                    <pic:cNvPr id="0" name="confusion_matrix_accuracy_ensemble.png"/>
+                    <pic:cNvPicPr/>
+                  </pic:nvPicPr>
+                  <pic:blipFill>
+                    <a:blip r:embed="rId13"/>
+                    <a:stretch>
+                      <a:fillRect/>
+                    </a:stretch>
+                  </pic:blipFill>
+                  <pic:spPr>
+                    <a:xfrm>
+                      <a:off x="0" y="0"/>
+                      <a:ext cx="5029200" cy="1188720"/>
+                    </a:xfrm>
+                    <a:prstGeom prst="rect"/>
+                  </pic:spPr>
+                </pic:pic>
+              </a:graphicData>
+            </a:graphic>
+          </wp:inline>
+        </w:drawing>
+      </w:r>
+    </w:p>
+    <w:p>
+      <w:pPr>
+        <w:spacing w:before="0" w:after="200"/>
+        <w:jc w:val="center"/>
+      </w:pPr>
+      <w:r>
+        <w:rPr>
+          <w:rFonts w:ascii="Times New Roman" w:hAnsi="Times New Roman"/>
+          <w:i/>
+          <w:sz w:val="18"/>
+        </w:rPr>
+        <w:t>Fig. Accuracy Optimization Confusion Matrices</w:t>
+      </w:r>
+    </w:p>
+    <w:p>
+      <w:pPr>
+        <w:spacing w:before="0" w:after="90" w:line="276" w:lineRule="auto"/>
+        <w:jc w:val="both"/>
+      </w:pPr>
+      <w:r>
+        <w:rPr>
+          <w:rFonts w:ascii="Times New Roman" w:hAnsi="Times New Roman"/>
+          <w:b w:val="0"/>
+          <w:i/>
+          <w:color w:val="1E1E1E"/>
+          <w:sz w:val="20"/>
+        </w:rPr>
+        <w:t>Fig. 5. Confusion matrices on the holdout test set ($N=550$) for (from left to right) Original Variant A Softmax Baseline, Variant A Seed 42 with Label Smoothing, 3-Seed Ensemble with TTA ($\tau=0.0$), and 3-Seed Ensemble with Logit Adjustment ($\tau=1.0$).</w:t>
+      </w:r>
+    </w:p>
+    <w:p>
+      <w:pPr>
+        <w:spacing w:before="0" w:after="90" w:line="276" w:lineRule="auto"/>
+        <w:jc w:val="both"/>
+      </w:pPr>
+      <w:r>
+        <w:rPr>
+          <w:rFonts w:ascii="Times New Roman" w:hAnsi="Times New Roman"/>
+          <w:b w:val="0"/>
+          <w:i w:val="0"/>
+          <w:color w:val="1E1E1E"/>
+          <w:sz w:val="20"/>
+        </w:rPr>
+        <w:t>---</w:t>
+      </w:r>
+    </w:p>
+    <w:p>
+      <w:pPr>
+        <w:spacing w:before="0" w:after="90" w:line="276" w:lineRule="auto"/>
+        <w:jc w:val="both"/>
+      </w:pPr>
+      <w:r>
+        <w:rPr>
+          <w:rFonts w:ascii="Times New Roman" w:hAnsi="Times New Roman"/>
+          <w:b w:val="0"/>
+          <w:i w:val="0"/>
+          <w:color w:val="1E1E1E"/>
+          <w:sz w:val="20"/>
+        </w:rPr>
+        <w:t>---</w:t>
+      </w:r>
+    </w:p>
+    <w:p>
+      <w:pPr>
+        <w:keepNext/>
+        <w:spacing w:before="280" w:after="80"/>
+      </w:pPr>
+      <w:r>
+        <w:rPr>
+          <w:rFonts w:ascii="Times New Roman" w:hAnsi="Times New Roman"/>
+          <w:b/>
+          <w:color w:val="142850"/>
+          <w:sz w:val="23"/>
+        </w:rPr>
+        <w:t>VII. DISCUSSION AND CLINICAL IMPLICATIONS</w:t>
       </w:r>
     </w:p>
     <w:p>
@@ -9276,7 +12362,7 @@
           <w:color w:val="283246"/>
           <w:sz w:val="21"/>
         </w:rPr>
-        <w:t>B. Preserving the Safety Envelope in Expert System Pipelines</w:t>
+        <w:t>A. The Clinical Cost Asymmetry of Triage Errors</w:t>
       </w:r>
     </w:p>
     <w:p>
@@ -9292,22 +12378,14 @@
           <w:color w:val="1E1E1E"/>
           <w:sz w:val="20"/>
         </w:rPr>
-        <w:t>As detailed in Section I, deployed clinical AI operates as an expert-system-style decision-support pipeline. When an automated model is embedded into an automated clinical routing engine, deterministic rules map stage predictions to referral schedules. Because Variant C eliminates catastrophic errors and confines $96.1\%$ of all predictions to within $\pm 1$ grade ($d \le 1$), the downstream expert system operates within a bounded safety envelope:</w:t>
+        <w:t>The primary contribution of this work is establishing that model evaluation for medical grading must transcend unweighted accuracy to consider the asymmetric clinical costs of diagnostic errors. In ophthalmic screening, a false positive between adjacent grades (e.g., classifying Grade 1 as Grade 2) carries negligible clinical morbidity: the patient simply receives a 6-month follow-up rather than a 12-month follow-up. In contrast, a false negative spanning multiple grades (e.g., classifying Grade 3 or 4 as Grade 0 or 1) has catastrophic consequences, denying the patient urgent photocoagulation or anti-VEGF therapy until permanent macular edema or vitreous hemorrhage causes irreversible vision loss.</w:t>
       </w:r>
     </w:p>
     <w:p>
       <w:pPr>
-        <w:spacing w:before="20" w:after="40" w:line="276" w:lineRule="auto"/>
-        <w:ind w:left="432"/>
-      </w:pPr>
-      <w:r>
-        <w:rPr>
-          <w:rFonts w:ascii="Times New Roman" w:hAnsi="Times New Roman"/>
-          <w:b/>
-          <w:sz w:val="20"/>
-        </w:rPr>
-        <w:t xml:space="preserve">• </w:t>
-      </w:r>
+        <w:spacing w:before="0" w:after="90" w:line="276" w:lineRule="auto"/>
+        <w:jc w:val="both"/>
+      </w:pPr>
       <w:r>
         <w:rPr>
           <w:rFonts w:ascii="Times New Roman" w:hAnsi="Times New Roman"/>
@@ -9316,55 +12394,7 @@
           <w:color w:val="1E1E1E"/>
           <w:sz w:val="20"/>
         </w:rPr>
-        <w:t>Severe (Grade 3) and Proliferative (Grade 4) patients are protected against being misclassified into the healthy cohort (Grade 0).</w:t>
-      </w:r>
-    </w:p>
-    <w:p>
-      <w:pPr>
-        <w:spacing w:before="20" w:after="40" w:line="276" w:lineRule="auto"/>
-        <w:ind w:left="432"/>
-      </w:pPr>
-      <w:r>
-        <w:rPr>
-          <w:rFonts w:ascii="Times New Roman" w:hAnsi="Times New Roman"/>
-          <w:b/>
-          <w:sz w:val="20"/>
-        </w:rPr>
-        <w:t xml:space="preserve">• </w:t>
-      </w:r>
-      <w:r>
-        <w:rPr>
-          <w:rFonts w:ascii="Times New Roman" w:hAnsi="Times New Roman"/>
-          <w:b w:val="0"/>
-          <w:i w:val="0"/>
-          <w:color w:val="1E1E1E"/>
-          <w:sz w:val="20"/>
-        </w:rPr>
-        <w:t>Patients requiring urgent intervention are reliably assigned to escalated referral pathways.</w:t>
-      </w:r>
-    </w:p>
-    <w:p>
-      <w:pPr>
-        <w:spacing w:before="20" w:after="40" w:line="276" w:lineRule="auto"/>
-        <w:ind w:left="432"/>
-      </w:pPr>
-      <w:r>
-        <w:rPr>
-          <w:rFonts w:ascii="Times New Roman" w:hAnsi="Times New Roman"/>
-          <w:b/>
-          <w:sz w:val="20"/>
-        </w:rPr>
-        <w:t xml:space="preserve">• </w:t>
-      </w:r>
-      <w:r>
-        <w:rPr>
-          <w:rFonts w:ascii="Times New Roman" w:hAnsi="Times New Roman"/>
-          <w:b w:val="0"/>
-          <w:i w:val="0"/>
-          <w:color w:val="1E1E1E"/>
-          <w:sz w:val="20"/>
-        </w:rPr>
-        <w:t>Multi-grade triage failures ($d \ge 2$) are suppressed to just $3.8\%$ (a $32.1\%$ relative reduction compared to the $5.6\%$ severe error rate in the Softmax baseline).</w:t>
+        <w:t>Standard softmax cross-entropy is agnostic to this asymmetry because its loss gradient does not factor in label distance. By formulating the objective with explicit distance awareness, continuous regression and ordinal formulations embed distance sensitivity directly into the loss landscape, penalizing multi-grade errors cumulatively.</w:t>
       </w:r>
     </w:p>
     <w:p>
@@ -9380,7 +12410,7 @@
           <w:color w:val="283246"/>
           <w:sz w:val="21"/>
         </w:rPr>
-        <w:t>C. Mathematical Dynamics of Continuous Regression vs. Ordinal Thresholding</w:t>
+        <w:t>B. Preserving the Safety Envelope in Expert System Pipelines</w:t>
       </w:r>
     </w:p>
     <w:p>
@@ -9396,7 +12426,7 @@
           <w:color w:val="1E1E1E"/>
           <w:sz w:val="20"/>
         </w:rPr>
-        <w:t>The empirical triumph of Variant C (Continuous Regression with Smooth L1 loss, QWK $0.8788$) over standard nominal classification highlights the efficacy of direct distance penalization in deep representation learning:</w:t>
+        <w:t>As detailed in Section I, deployed clinical AI operates as an expert-system-style decision-support pipeline. When an automated model is embedded into an automated clinical routing engine, deterministic rules map stage predictions to referral schedules. Because Variant C eliminates catastrophic errors and confines $96.1\%$ of all predictions to within $\pm 1$ grade ($d \le 1$), the downstream expert system operates within a bounded safety envelope:</w:t>
       </w:r>
     </w:p>
     <w:p>
@@ -9410,17 +12440,7 @@
           <w:b/>
           <w:sz w:val="20"/>
         </w:rPr>
-        <w:t xml:space="preserve">1. </w:t>
-      </w:r>
-      <w:r>
-        <w:rPr>
-          <w:rFonts w:ascii="Times New Roman" w:hAnsi="Times New Roman"/>
-          <w:b/>
-          <w:i w:val="0"/>
-          <w:color w:val="1E1E1E"/>
-          <w:sz w:val="20"/>
-        </w:rPr>
-        <w:t>Curvature of Smooth L1:</w:t>
+        <w:t xml:space="preserve">• </w:t>
       </w:r>
       <w:r>
         <w:rPr>
@@ -9430,7 +12450,7 @@
           <w:color w:val="1E1E1E"/>
           <w:sz w:val="20"/>
         </w:rPr>
-        <w:t xml:space="preserve"> Unlike mean squared error, which can destabilize gradients on hard retinal outliers, Smooth L1 transitions gracefully from quadratic curvature near $|y - \hat{s}| &lt; 1.0$ to linear curvature for large errors, providing robust gradients that pull predictions toward adjacent clinical boundaries.</w:t>
+        <w:t>Severe (Grade 3) and Proliferative (Grade 4) patients are protected against being misclassified into the healthy cohort (Grade 0).</w:t>
       </w:r>
     </w:p>
     <w:p>
@@ -9444,17 +12464,7 @@
           <w:b/>
           <w:sz w:val="20"/>
         </w:rPr>
-        <w:t xml:space="preserve">2. </w:t>
-      </w:r>
-      <w:r>
-        <w:rPr>
-          <w:rFonts w:ascii="Times New Roman" w:hAnsi="Times New Roman"/>
-          <w:b/>
-          <w:i w:val="0"/>
-          <w:color w:val="1E1E1E"/>
-          <w:sz w:val="20"/>
-        </w:rPr>
-        <w:t>Impact of Class Skew on CORAL:</w:t>
+        <w:t xml:space="preserve">• </w:t>
       </w:r>
       <w:r>
         <w:rPr>
@@ -9464,7 +12474,31 @@
           <w:color w:val="1E1E1E"/>
           <w:sz w:val="20"/>
         </w:rPr>
-        <w:t xml:space="preserve"> In contrast, Variant B (CORAL) suffered on the APTOS 2019 benchmark ($0.7273$ QWK) due to extreme class imbalance ($49.3\%$ Grade 0 vs. $5.3\%$ Grade 3). In unweighted CORAL, the loss is the unweighted sum of $K-1$ binary tasks. When healthy samples overwhelmingly dominate the training batch, the gradient for the lowest binary threshold ($y &gt; 0$) overpowers higher thresholds ($y &gt; 2, y &gt; 3$), compressing the decision margins for advanced grades. Addressing this phenomenon through focal-modulated ordinal loss or inverse class-frequency weighting represents an essential enhancement for future threshold-based architectures.</w:t>
+        <w:t>Patients requiring urgent intervention are reliably assigned to escalated referral pathways.</w:t>
+      </w:r>
+    </w:p>
+    <w:p>
+      <w:pPr>
+        <w:spacing w:before="20" w:after="40" w:line="276" w:lineRule="auto"/>
+        <w:ind w:left="432"/>
+      </w:pPr>
+      <w:r>
+        <w:rPr>
+          <w:rFonts w:ascii="Times New Roman" w:hAnsi="Times New Roman"/>
+          <w:b/>
+          <w:sz w:val="20"/>
+        </w:rPr>
+        <w:t xml:space="preserve">• </w:t>
+      </w:r>
+      <w:r>
+        <w:rPr>
+          <w:rFonts w:ascii="Times New Roman" w:hAnsi="Times New Roman"/>
+          <w:b w:val="0"/>
+          <w:i w:val="0"/>
+          <w:color w:val="1E1E1E"/>
+          <w:sz w:val="20"/>
+        </w:rPr>
+        <w:t>Multi-grade triage failures ($d \ge 2$) are suppressed to just $3.8\%$ (a $32.1\%$ relative reduction compared to the $5.6\%$ severe error rate in the Softmax baseline).</w:t>
       </w:r>
     </w:p>
     <w:p>
@@ -9480,7 +12514,7 @@
           <w:color w:val="283246"/>
           <w:sz w:val="21"/>
         </w:rPr>
-        <w:t>D. Study Limitations and Threats to Validity</w:t>
+        <w:t>C. Mathematical Dynamics of Continuous Regression vs. Ordinal Thresholding</w:t>
       </w:r>
     </w:p>
     <w:p>
@@ -9496,7 +12530,7 @@
           <w:color w:val="1E1E1E"/>
           <w:sz w:val="20"/>
         </w:rPr>
-        <w:t>We explicitly document the following limitations of our study:</w:t>
+        <w:t>The empirical triumph of Variant C (Continuous Regression with Smooth L1 loss, QWK $0.8788$) over standard nominal classification highlights the efficacy of direct distance penalization in deep representation learning:</w:t>
       </w:r>
     </w:p>
     <w:p>
@@ -9520,7 +12554,7 @@
           <w:color w:val="1E1E1E"/>
           <w:sz w:val="20"/>
         </w:rPr>
-        <w:t>Hardware Compute Optimization:</w:t>
+        <w:t>Curvature of Smooth L1:</w:t>
       </w:r>
       <w:r>
         <w:rPr>
@@ -9530,7 +12564,7 @@
           <w:color w:val="1E1E1E"/>
           <w:sz w:val="20"/>
         </w:rPr>
-        <w:t xml:space="preserve"> Utilizing the newly launched NVIDIA GeForce RTX 5050 Laptop GPU (sm_120 Blackwell microarchitecture) required specialized configuration of PyTorch 2.14.0 with CUDA 13.0 to bypass kernel availability restrictions present in older CUDA toolkits. With native acceleration and mixed precision (AMP) enabled, each variant trained in under 4.5 minutes across 8 epochs with minimal memory consumption (&lt;540 MiB VRAM). Scaling to deeper foundation backbones (e.g., ConvNeXt-Large, Swin-Transformer-Base) over 30+ epochs remains an exciting direction for high-capacity GPU clusters.</w:t>
+        <w:t xml:space="preserve"> Unlike mean squared error, which can destabilize gradients on hard retinal outliers, Smooth L1 transitions gracefully from quadratic curvature near $|y - \hat{s}| &lt; 1.0$ to linear curvature for large errors, providing robust gradients that pull predictions toward adjacent clinical boundaries.</w:t>
       </w:r>
     </w:p>
     <w:p>
@@ -9554,7 +12588,7 @@
           <w:color w:val="1E1E1E"/>
           <w:sz w:val="20"/>
         </w:rPr>
-        <w:t>Single-Dataset Evaluation:</w:t>
+        <w:t>Impact of Class Skew on CORAL:</w:t>
       </w:r>
       <w:r>
         <w:rPr>
@@ -9564,41 +12598,7 @@
           <w:color w:val="1E1E1E"/>
           <w:sz w:val="20"/>
         </w:rPr>
-        <w:t xml:space="preserve"> Although APTOS 2019 contains diverse multi-clinic imagery from across India, testing on external datasets (e.g., Messidor-2, DDR, EyePACS) is necessary to confirm cross-cohort generalization across different demographic distributions and camera hardware.</w:t>
-      </w:r>
-    </w:p>
-    <w:p>
-      <w:pPr>
-        <w:spacing w:before="20" w:after="40" w:line="276" w:lineRule="auto"/>
-        <w:ind w:left="432"/>
-      </w:pPr>
-      <w:r>
-        <w:rPr>
-          <w:rFonts w:ascii="Times New Roman" w:hAnsi="Times New Roman"/>
-          <w:b/>
-          <w:sz w:val="20"/>
-        </w:rPr>
-        <w:t xml:space="preserve">3. </w:t>
-      </w:r>
-      <w:r>
-        <w:rPr>
-          <w:rFonts w:ascii="Times New Roman" w:hAnsi="Times New Roman"/>
-          <w:b/>
-          <w:i w:val="0"/>
-          <w:color w:val="1E1E1E"/>
-          <w:sz w:val="20"/>
-        </w:rPr>
-        <w:t>Absence of Lesion-Level Guidance:</w:t>
-      </w:r>
-      <w:r>
-        <w:rPr>
-          <w:rFonts w:ascii="Times New Roman" w:hAnsi="Times New Roman"/>
-          <w:b w:val="0"/>
-          <w:i w:val="0"/>
-          <w:color w:val="1E1E1E"/>
-          <w:sz w:val="20"/>
-        </w:rPr>
-        <w:t xml:space="preserve"> Our pipeline relies on whole-image classification without explicit lesion segmentation masks (as used in [7]). Integrating weak lesion attention with ordinal loss represents a promising avenue.</w:t>
+        <w:t xml:space="preserve"> In contrast, Variant B (CORAL) suffered on the APTOS 2019 benchmark ($0.7273$ QWK) due to extreme class imbalance ($49.3\%$ Grade 0 vs. $5.3\%$ Grade 3). In unweighted CORAL, the loss is the unweighted sum of $K-1$ binary tasks. When healthy samples overwhelmingly dominate the training batch, the gradient for the lowest binary threshold ($y &gt; 0$) overpowers higher thresholds ($y &gt; 2, y &gt; 3$), compressing the decision margins for advanced grades. Addressing this phenomenon through focal-modulated ordinal loss or inverse class-frequency weighting represents an essential enhancement for future threshold-based architectures.</w:t>
       </w:r>
     </w:p>
     <w:p>
@@ -9614,7 +12614,7 @@
           <w:color w:val="283246"/>
           <w:sz w:val="21"/>
         </w:rPr>
-        <w:t>E. Revised Approach: Rationale for Maintaining EfficientNet-B0 over Larger Architectures</w:t>
+        <w:t>D. Study Limitations and Threats to Validity</w:t>
       </w:r>
     </w:p>
     <w:p>
@@ -9630,7 +12630,21 @@
           <w:color w:val="1E1E1E"/>
           <w:sz w:val="20"/>
         </w:rPr>
-        <w:t xml:space="preserve">A frequent tendency in deep learning benchmarks is scaling backbone capacity (e.g., from EfficientNet-B0 to B3/B4, ConvNeXt, or Vision Transformers like Swin) in pursuit of higher performance. In this study, we deliberately maintained </w:t>
+        <w:t>We explicitly document the following limitations of our study:</w:t>
+      </w:r>
+    </w:p>
+    <w:p>
+      <w:pPr>
+        <w:spacing w:before="20" w:after="40" w:line="276" w:lineRule="auto"/>
+        <w:ind w:left="432"/>
+      </w:pPr>
+      <w:r>
+        <w:rPr>
+          <w:rFonts w:ascii="Times New Roman" w:hAnsi="Times New Roman"/>
+          <w:b/>
+          <w:sz w:val="20"/>
+        </w:rPr>
+        <w:t xml:space="preserve">1. </w:t>
       </w:r>
       <w:r>
         <w:rPr>
@@ -9640,7 +12654,7 @@
           <w:color w:val="1E1E1E"/>
           <w:sz w:val="20"/>
         </w:rPr>
-        <w:t>EfficientNet-B0</w:t>
+        <w:t>Hardware Compute Optimization:</w:t>
       </w:r>
       <w:r>
         <w:rPr>
@@ -9650,14 +12664,32 @@
           <w:color w:val="1E1E1E"/>
           <w:sz w:val="20"/>
         </w:rPr>
-        <w:t xml:space="preserve"> ($5.3\text{M}$ parameters) as our uniform backbone across all evaluations.</w:t>
+        <w:t xml:space="preserve"> Utilizing the newly launched NVIDIA GeForce RTX 5050 Laptop GPU (sm_120 Blackwell microarchitecture) required specialized configuration of PyTorch 2.14.0 with CUDA 13.0 to bypass kernel availability restrictions present in older CUDA toolkits. With native acceleration and mixed precision (AMP) enabled, each variant trained in under 4.5 minutes across 8 epochs with minimal memory consumption (&lt;540 MiB VRAM). Scaling to deeper foundation backbones (e.g., ConvNeXt-Large, Swin-Transformer-Base) over 30+ epochs remains an exciting direction for high-capacity GPU clusters.</w:t>
       </w:r>
     </w:p>
     <w:p>
       <w:pPr>
-        <w:spacing w:before="0" w:after="90" w:line="276" w:lineRule="auto"/>
-        <w:jc w:val="both"/>
-      </w:pPr>
+        <w:spacing w:before="20" w:after="40" w:line="276" w:lineRule="auto"/>
+        <w:ind w:left="432"/>
+      </w:pPr>
+      <w:r>
+        <w:rPr>
+          <w:rFonts w:ascii="Times New Roman" w:hAnsi="Times New Roman"/>
+          <w:b/>
+          <w:sz w:val="20"/>
+        </w:rPr>
+        <w:t xml:space="preserve">2. </w:t>
+      </w:r>
+      <w:r>
+        <w:rPr>
+          <w:rFonts w:ascii="Times New Roman" w:hAnsi="Times New Roman"/>
+          <w:b/>
+          <w:i w:val="0"/>
+          <w:color w:val="1E1E1E"/>
+          <w:sz w:val="20"/>
+        </w:rPr>
+        <w:t>Single-Dataset Evaluation:</w:t>
+      </w:r>
       <w:r>
         <w:rPr>
           <w:rFonts w:ascii="Times New Roman" w:hAnsi="Times New Roman"/>
@@ -9666,7 +12698,7 @@
           <w:color w:val="1E1E1E"/>
           <w:sz w:val="20"/>
         </w:rPr>
-        <w:t>This architectural decision is rooted in sample complexity and overfitting dynamics:</w:t>
+        <w:t xml:space="preserve"> Although APTOS 2019 contains diverse multi-clinic imagery from across India, testing on external datasets (e.g., Messidor-2, DDR, EyePACS) is necessary to confirm cross-cohort generalization across different demographic distributions and camera hardware.</w:t>
       </w:r>
     </w:p>
     <w:p>
@@ -9680,7 +12712,7 @@
           <w:b/>
           <w:sz w:val="20"/>
         </w:rPr>
-        <w:t xml:space="preserve">1. </w:t>
+        <w:t xml:space="preserve">3. </w:t>
       </w:r>
       <w:r>
         <w:rPr>
@@ -9690,7 +12722,7 @@
           <w:color w:val="1E1E1E"/>
           <w:sz w:val="20"/>
         </w:rPr>
-        <w:t>Severe Minority Class Scarcity:</w:t>
+        <w:t>Absence of Lesion-Level Guidance:</w:t>
       </w:r>
       <w:r>
         <w:rPr>
@@ -9700,21 +12732,39 @@
           <w:color w:val="1E1E1E"/>
           <w:sz w:val="20"/>
         </w:rPr>
-        <w:t xml:space="preserve"> The APTOS 2019 training split contains only $2,563$ total images, with the vision-threatening Severe NPDR class containing merely $135$ instances ($5.3\%$). Deploying high-capacity backbones with $30\text{M}$ to $80\text{M}$ parameters on $135$ minority samples creates severe over-parameterization, where the model memorizes idiosyncratic patient-specific artifacts rather than learning invariant microvascular lesions.</w:t>
+        <w:t xml:space="preserve"> Our pipeline relies on whole-image classification without explicit lesion segmentation masks (as used in [7]). Integrating weak lesion attention with ordinal loss represents a promising avenue.</w:t>
       </w:r>
     </w:p>
     <w:p>
       <w:pPr>
-        <w:spacing w:before="20" w:after="40" w:line="276" w:lineRule="auto"/>
-        <w:ind w:left="432"/>
+        <w:keepNext/>
+        <w:spacing w:before="200" w:after="60"/>
       </w:pPr>
       <w:r>
         <w:rPr>
           <w:rFonts w:ascii="Times New Roman" w:hAnsi="Times New Roman"/>
           <w:b/>
-          <w:sz w:val="20"/>
-        </w:rPr>
-        <w:t xml:space="preserve">2. </w:t>
+          <w:i/>
+          <w:color w:val="283246"/>
+          <w:sz w:val="21"/>
+        </w:rPr>
+        <w:t>E. Revised Approach: Rationale for Maintaining EfficientNet-B0 over Larger Architectures</w:t>
+      </w:r>
+    </w:p>
+    <w:p>
+      <w:pPr>
+        <w:spacing w:before="0" w:after="90" w:line="276" w:lineRule="auto"/>
+        <w:jc w:val="both"/>
+      </w:pPr>
+      <w:r>
+        <w:rPr>
+          <w:rFonts w:ascii="Times New Roman" w:hAnsi="Times New Roman"/>
+          <w:b w:val="0"/>
+          <w:i w:val="0"/>
+          <w:color w:val="1E1E1E"/>
+          <w:sz w:val="20"/>
+        </w:rPr>
+        <w:t xml:space="preserve">A frequent tendency in deep learning benchmarks is scaling backbone capacity (e.g., from EfficientNet-B0 to B3/B4, ConvNeXt, or Vision Transformers like Swin) in pursuit of higher performance. In this study, we deliberately maintained </w:t>
       </w:r>
       <w:r>
         <w:rPr>
@@ -9724,7 +12774,7 @@
           <w:color w:val="1E1E1E"/>
           <w:sz w:val="20"/>
         </w:rPr>
-        <w:t>Loss Formulation Dominance:</w:t>
+        <w:t>EfficientNet-B0</w:t>
       </w:r>
       <w:r>
         <w:rPr>
@@ -9734,6 +12784,90 @@
           <w:color w:val="1E1E1E"/>
           <w:sz w:val="20"/>
         </w:rPr>
+        <w:t xml:space="preserve"> ($5.3\text{M}$ parameters) as our uniform backbone across all evaluations.</w:t>
+      </w:r>
+    </w:p>
+    <w:p>
+      <w:pPr>
+        <w:spacing w:before="0" w:after="90" w:line="276" w:lineRule="auto"/>
+        <w:jc w:val="both"/>
+      </w:pPr>
+      <w:r>
+        <w:rPr>
+          <w:rFonts w:ascii="Times New Roman" w:hAnsi="Times New Roman"/>
+          <w:b w:val="0"/>
+          <w:i w:val="0"/>
+          <w:color w:val="1E1E1E"/>
+          <w:sz w:val="20"/>
+        </w:rPr>
+        <w:t>This architectural decision is rooted in sample complexity and overfitting dynamics:</w:t>
+      </w:r>
+    </w:p>
+    <w:p>
+      <w:pPr>
+        <w:spacing w:before="20" w:after="40" w:line="276" w:lineRule="auto"/>
+        <w:ind w:left="432"/>
+      </w:pPr>
+      <w:r>
+        <w:rPr>
+          <w:rFonts w:ascii="Times New Roman" w:hAnsi="Times New Roman"/>
+          <w:b/>
+          <w:sz w:val="20"/>
+        </w:rPr>
+        <w:t xml:space="preserve">1. </w:t>
+      </w:r>
+      <w:r>
+        <w:rPr>
+          <w:rFonts w:ascii="Times New Roman" w:hAnsi="Times New Roman"/>
+          <w:b/>
+          <w:i w:val="0"/>
+          <w:color w:val="1E1E1E"/>
+          <w:sz w:val="20"/>
+        </w:rPr>
+        <w:t>Severe Minority Class Scarcity:</w:t>
+      </w:r>
+      <w:r>
+        <w:rPr>
+          <w:rFonts w:ascii="Times New Roman" w:hAnsi="Times New Roman"/>
+          <w:b w:val="0"/>
+          <w:i w:val="0"/>
+          <w:color w:val="1E1E1E"/>
+          <w:sz w:val="20"/>
+        </w:rPr>
+        <w:t xml:space="preserve"> The APTOS 2019 training split contains only $2,563$ total images, with the vision-threatening Severe NPDR class containing merely $135$ instances ($5.3\%$). Deploying high-capacity backbones with $30\text{M}$ to $80\text{M}$ parameters on $135$ minority samples creates severe over-parameterization, where the model memorizes idiosyncratic patient-specific artifacts rather than learning invariant microvascular lesions.</w:t>
+      </w:r>
+    </w:p>
+    <w:p>
+      <w:pPr>
+        <w:spacing w:before="20" w:after="40" w:line="276" w:lineRule="auto"/>
+        <w:ind w:left="432"/>
+      </w:pPr>
+      <w:r>
+        <w:rPr>
+          <w:rFonts w:ascii="Times New Roman" w:hAnsi="Times New Roman"/>
+          <w:b/>
+          <w:sz w:val="20"/>
+        </w:rPr>
+        <w:t xml:space="preserve">2. </w:t>
+      </w:r>
+      <w:r>
+        <w:rPr>
+          <w:rFonts w:ascii="Times New Roman" w:hAnsi="Times New Roman"/>
+          <w:b/>
+          <w:i w:val="0"/>
+          <w:color w:val="1E1E1E"/>
+          <w:sz w:val="20"/>
+        </w:rPr>
+        <w:t>Loss Formulation Dominance:</w:t>
+      </w:r>
+      <w:r>
+        <w:rPr>
+          <w:rFonts w:ascii="Times New Roman" w:hAnsi="Times New Roman"/>
+          <w:b w:val="0"/>
+          <w:i w:val="0"/>
+          <w:color w:val="1E1E1E"/>
+          <w:sz w:val="20"/>
+        </w:rPr>
         <w:t xml:space="preserve"> Our empirical results show that changing the loss framing (from CORAL to CORN) yielded a massive $+0.1209$ QWK increase and slashed catastrophic triage errors from $26.4\%$ to $5.1\%$ on the </w:t>
       </w:r>
       <w:r>
@@ -9793,6 +12927,22 @@
     </w:p>
     <w:p>
       <w:pPr>
+        <w:keepNext/>
+        <w:spacing w:before="200" w:after="60"/>
+      </w:pPr>
+      <w:r>
+        <w:rPr>
+          <w:rFonts w:ascii="Times New Roman" w:hAnsi="Times New Roman"/>
+          <w:b/>
+          <w:i/>
+          <w:color w:val="283246"/>
+          <w:sz w:val="21"/>
+        </w:rPr>
+        <w:t>F. The Strategic Trade-off Between Overall Accuracy and Minority-Class Sensitivity</w:t>
+      </w:r>
+    </w:p>
+    <w:p>
+      <w:pPr>
         <w:spacing w:before="0" w:after="90" w:line="276" w:lineRule="auto"/>
         <w:jc w:val="both"/>
       </w:pPr>
@@ -9804,6 +12954,224 @@
           <w:color w:val="1E1E1E"/>
           <w:sz w:val="20"/>
         </w:rPr>
+        <w:t>The contrast between the results of Variant CORN (Section VI.B) and the 3-Seed Label-Smoothed Ensemble (Section VI.E) underscores a foundational design trade-off in medical artificial intelligence:</w:t>
+      </w:r>
+    </w:p>
+    <w:p>
+      <w:pPr>
+        <w:spacing w:before="20" w:after="40" w:line="276" w:lineRule="auto"/>
+        <w:ind w:left="432"/>
+      </w:pPr>
+      <w:r>
+        <w:rPr>
+          <w:rFonts w:ascii="Times New Roman" w:hAnsi="Times New Roman"/>
+          <w:b/>
+          <w:sz w:val="20"/>
+        </w:rPr>
+        <w:t xml:space="preserve">1. </w:t>
+      </w:r>
+      <w:r>
+        <w:rPr>
+          <w:rFonts w:ascii="Times New Roman" w:hAnsi="Times New Roman"/>
+          <w:b/>
+          <w:i w:val="0"/>
+          <w:color w:val="1E1E1E"/>
+          <w:sz w:val="20"/>
+        </w:rPr>
+        <w:t>The Ordinal-Sensitivity Regime (Variant CORN):</w:t>
+      </w:r>
+      <w:r>
+        <w:rPr>
+          <w:rFonts w:ascii="Times New Roman" w:hAnsi="Times New Roman"/>
+          <w:b w:val="0"/>
+          <w:i w:val="0"/>
+          <w:color w:val="1E1E1E"/>
+          <w:sz w:val="20"/>
+        </w:rPr>
+        <w:t xml:space="preserve"> When the primary clinical objective is safety-critical screening triage—where failing to detect a patient with sight-threatening Grade 3 Severe NPDR leads to irreversible vision loss—Variant CORN is superior. By utilizing conditional cumulative rank probabilities, class-balanced sample weighting, and soft-QWK loss, CORN attains a Severe NPDR Sensitivity of </w:t>
+      </w:r>
+      <w:r>
+        <w:rPr>
+          <w:rFonts w:ascii="Times New Roman" w:hAnsi="Times New Roman"/>
+          <w:b/>
+          <w:i w:val="0"/>
+          <w:color w:val="1E1E1E"/>
+          <w:sz w:val="20"/>
+        </w:rPr>
+        <w:t>$65.7\%$</w:t>
+      </w:r>
+      <w:r>
+        <w:rPr>
+          <w:rFonts w:ascii="Times New Roman" w:hAnsi="Times New Roman"/>
+          <w:b w:val="0"/>
+          <w:i w:val="0"/>
+          <w:color w:val="1E1E1E"/>
+          <w:sz w:val="20"/>
+        </w:rPr>
+        <w:t xml:space="preserve"> and Mild NPDR Sensitivity of </w:t>
+      </w:r>
+      <w:r>
+        <w:rPr>
+          <w:rFonts w:ascii="Times New Roman" w:hAnsi="Times New Roman"/>
+          <w:b/>
+          <w:i w:val="0"/>
+          <w:color w:val="1E1E1E"/>
+          <w:sz w:val="20"/>
+        </w:rPr>
+        <w:t>$66.1\%$</w:t>
+      </w:r>
+      <w:r>
+        <w:rPr>
+          <w:rFonts w:ascii="Times New Roman" w:hAnsi="Times New Roman"/>
+          <w:b w:val="0"/>
+          <w:i w:val="0"/>
+          <w:color w:val="1E1E1E"/>
+          <w:sz w:val="20"/>
+        </w:rPr>
+        <w:t>, with an overall QWK of $0.8482$. However, prioritizing minority recall inevitably sacrifices majority-class specificity, yielding an aggregate accuracy of $69.09\%$.</w:t>
+      </w:r>
+    </w:p>
+    <w:p>
+      <w:pPr>
+        <w:spacing w:before="20" w:after="40" w:line="276" w:lineRule="auto"/>
+        <w:ind w:left="432"/>
+      </w:pPr>
+      <w:r>
+        <w:rPr>
+          <w:rFonts w:ascii="Times New Roman" w:hAnsi="Times New Roman"/>
+          <w:b/>
+          <w:sz w:val="20"/>
+        </w:rPr>
+        <w:t xml:space="preserve">2. </w:t>
+      </w:r>
+      <w:r>
+        <w:rPr>
+          <w:rFonts w:ascii="Times New Roman" w:hAnsi="Times New Roman"/>
+          <w:b/>
+          <w:i w:val="0"/>
+          <w:color w:val="1E1E1E"/>
+          <w:sz w:val="20"/>
+        </w:rPr>
+        <w:t>The High-Accuracy Confirmatory Regime (3-Seed Ensemble):</w:t>
+      </w:r>
+      <w:r>
+        <w:rPr>
+          <w:rFonts w:ascii="Times New Roman" w:hAnsi="Times New Roman"/>
+          <w:b w:val="0"/>
+          <w:i w:val="0"/>
+          <w:color w:val="1E1E1E"/>
+          <w:sz w:val="20"/>
+        </w:rPr>
+        <w:t xml:space="preserve"> Conversely, when the clinical objective is secondary telemedicine grading, automated clinical documentation, or high-throughput confirmatory reporting—where high diagnostic specificity and exact agreement on the abundant non-pathological population ($49.3\%$ of patients) are essential—the 3-Seed Ensemble with label smoothing and TTA is optimal. It delivers an overall accuracy of </w:t>
+      </w:r>
+      <w:r>
+        <w:rPr>
+          <w:rFonts w:ascii="Times New Roman" w:hAnsi="Times New Roman"/>
+          <w:b/>
+          <w:i w:val="0"/>
+          <w:color w:val="1E1E1E"/>
+          <w:sz w:val="20"/>
+        </w:rPr>
+        <w:t>$83.82\%$</w:t>
+      </w:r>
+      <w:r>
+        <w:rPr>
+          <w:rFonts w:ascii="Times New Roman" w:hAnsi="Times New Roman"/>
+          <w:b w:val="0"/>
+          <w:i w:val="0"/>
+          <w:color w:val="1E1E1E"/>
+          <w:sz w:val="20"/>
+        </w:rPr>
+        <w:t xml:space="preserve">, QWK of </w:t>
+      </w:r>
+      <w:r>
+        <w:rPr>
+          <w:rFonts w:ascii="Times New Roman" w:hAnsi="Times New Roman"/>
+          <w:b/>
+          <w:i w:val="0"/>
+          <w:color w:val="1E1E1E"/>
+          <w:sz w:val="20"/>
+        </w:rPr>
+        <w:t>$0.8859$</w:t>
+      </w:r>
+      <w:r>
+        <w:rPr>
+          <w:rFonts w:ascii="Times New Roman" w:hAnsi="Times New Roman"/>
+          <w:b w:val="0"/>
+          <w:i w:val="0"/>
+          <w:color w:val="1E1E1E"/>
+          <w:sz w:val="20"/>
+        </w:rPr>
+        <w:t xml:space="preserve">, and the lowest MAE of </w:t>
+      </w:r>
+      <w:r>
+        <w:rPr>
+          <w:rFonts w:ascii="Times New Roman" w:hAnsi="Times New Roman"/>
+          <w:b/>
+          <w:i w:val="0"/>
+          <w:color w:val="1E1E1E"/>
+          <w:sz w:val="20"/>
+        </w:rPr>
+        <w:t>$0.2200$</w:t>
+      </w:r>
+      <w:r>
+        <w:rPr>
+          <w:rFonts w:ascii="Times New Roman" w:hAnsi="Times New Roman"/>
+          <w:b w:val="0"/>
+          <w:i w:val="0"/>
+          <w:color w:val="1E1E1E"/>
+          <w:sz w:val="20"/>
+        </w:rPr>
+        <w:t>, with an exceptionally low catastrophic error rate of $4.36\%$.</w:t>
+      </w:r>
+    </w:p>
+    <w:p>
+      <w:pPr>
+        <w:spacing w:before="20" w:after="40" w:line="276" w:lineRule="auto"/>
+        <w:ind w:left="432"/>
+      </w:pPr>
+      <w:r>
+        <w:rPr>
+          <w:rFonts w:ascii="Times New Roman" w:hAnsi="Times New Roman"/>
+          <w:b/>
+          <w:sz w:val="20"/>
+        </w:rPr>
+        <w:t xml:space="preserve">3. </w:t>
+      </w:r>
+      <w:r>
+        <w:rPr>
+          <w:rFonts w:ascii="Times New Roman" w:hAnsi="Times New Roman"/>
+          <w:b/>
+          <w:i w:val="0"/>
+          <w:color w:val="1E1E1E"/>
+          <w:sz w:val="20"/>
+        </w:rPr>
+        <w:t>Deliberate Design Choice:</w:t>
+      </w:r>
+      <w:r>
+        <w:rPr>
+          <w:rFonts w:ascii="Times New Roman" w:hAnsi="Times New Roman"/>
+          <w:b w:val="0"/>
+          <w:i w:val="0"/>
+          <w:color w:val="1E1E1E"/>
+          <w:sz w:val="20"/>
+        </w:rPr>
+        <w:t xml:space="preserve"> Rather than viewing one framework as universally superior, our findings demonstrate that model selection must be aligned with the operational tier of the healthcare delivery pipeline. For primary community screening, the high-sensitivity ordinal framework (CORN) protects patients; for centralized diagnostic clinics, the high-accuracy ensemble minimizes false alarms.</w:t>
+      </w:r>
+    </w:p>
+    <w:p>
+      <w:pPr>
+        <w:spacing w:before="0" w:after="90" w:line="276" w:lineRule="auto"/>
+        <w:jc w:val="both"/>
+      </w:pPr>
+      <w:r>
+        <w:rPr>
+          <w:rFonts w:ascii="Times New Roman" w:hAnsi="Times New Roman"/>
+          <w:b w:val="0"/>
+          <w:i w:val="0"/>
+          <w:color w:val="1E1E1E"/>
+          <w:sz w:val="20"/>
+        </w:rPr>
         <w:t>---</w:t>
       </w:r>
     </w:p>
@@ -9835,7 +13203,7 @@
           <w:color w:val="1E1E1E"/>
           <w:sz w:val="20"/>
         </w:rPr>
-        <w:t>In this paper, we addressed the critical vulnerability of nominal multiclass loss in automated Diabetic Retinopathy stage grading. Standard categorical cross-entropy treats diagnostic errors with dangerous symmetry, risking catastrophic multi-grade triage failures in clinical screening programs. To resolve this limitation, we conducted an empirical benchmark comparing standard softmax classification, rank-consistent ordinal regression (CORAL), continuous scalar regression, and conditional ordinal regression (CORN) across an identical EfficientNet-B0 backbone on the APTOS 2019 benchmark.</w:t>
+        <w:t>In this paper, we addressed the critical vulnerability of nominal multiclass loss in automated Diabetic Retinopathy stage grading. Standard categorical cross-entropy treats diagnostic errors with dangerous symmetry, risking catastrophic multi-grade triage failures in clinical screening programs. To resolve this limitation, we conducted an empirical benchmark comparing standard softmax classification, rank-consistent ordinal regression (CORAL), continuous scalar regression, conditional ordinal regression (CORN), and an accuracy-optimized 3-seed ensemble across an identical EfficientNet-B0 backbone on the APTOS 2019 benchmark.</w:t>
       </w:r>
     </w:p>
     <w:p>
@@ -9885,7 +13253,7 @@
           <w:color w:val="1E1E1E"/>
           <w:sz w:val="20"/>
         </w:rPr>
-        <w:t xml:space="preserve"> achieved peak overall concordance with a Quadratic Weighted Kappa of </w:t>
+        <w:t xml:space="preserve"> achieved strong overall concordance with a Quadratic Weighted Kappa of </w:t>
       </w:r>
       <w:r>
         <w:rPr>
@@ -10103,7 +13471,7 @@
           <w:color w:val="1E1E1E"/>
           <w:sz w:val="20"/>
         </w:rPr>
-        <w:t>Loss-Level Inductive Bias Dominates Parameter Bloat:</w:t>
+        <w:t>Multi-Seed Regularized Ensembling</w:t>
       </w:r>
       <w:r>
         <w:rPr>
@@ -10113,14 +13481,18 @@
           <w:color w:val="1E1E1E"/>
           <w:sz w:val="20"/>
         </w:rPr>
-        <w:t xml:space="preserve"> Enforcing conditional rank dependency, effective-number class weighting, soft-QWK loss regularization, and test-time augmentation achieved clinical-grade agreement on EfficientNet-B0 without resorting to parameter-heavy backbones that overfit scarce medical data.</w:t>
-      </w:r>
-    </w:p>
-    <w:p>
-      <w:pPr>
-        <w:spacing w:before="0" w:after="90" w:line="276" w:lineRule="auto"/>
-        <w:jc w:val="both"/>
-      </w:pPr>
+        <w:t xml:space="preserve"> achieved the highest raw classification accuracy of </w:t>
+      </w:r>
+      <w:r>
+        <w:rPr>
+          <w:rFonts w:ascii="Times New Roman" w:hAnsi="Times New Roman"/>
+          <w:b/>
+          <w:i w:val="0"/>
+          <w:color w:val="1E1E1E"/>
+          <w:sz w:val="20"/>
+        </w:rPr>
+        <w:t>$83.82\%$ [80.73%, 86.73%]</w:t>
+      </w:r>
       <w:r>
         <w:rPr>
           <w:rFonts w:ascii="Times New Roman" w:hAnsi="Times New Roman"/>
@@ -10129,14 +13501,18 @@
           <w:color w:val="1E1E1E"/>
           <w:sz w:val="20"/>
         </w:rPr>
-        <w:t>Future research will focus on combining conditional ordinal loss with vision-language explanation models [6] to provide interpretable natural-language rationales alongside calibrated stage predictions in prospective clinical screening trials.</w:t>
-      </w:r>
-    </w:p>
-    <w:p>
-      <w:pPr>
-        <w:spacing w:before="0" w:after="90" w:line="276" w:lineRule="auto"/>
-        <w:jc w:val="both"/>
-      </w:pPr>
+        <w:t xml:space="preserve">, peak QWK of </w:t>
+      </w:r>
+      <w:r>
+        <w:rPr>
+          <w:rFonts w:ascii="Times New Roman" w:hAnsi="Times New Roman"/>
+          <w:b/>
+          <w:i w:val="0"/>
+          <w:color w:val="1E1E1E"/>
+          <w:sz w:val="20"/>
+        </w:rPr>
+        <w:t>$0.8859$</w:t>
+      </w:r>
       <w:r>
         <w:rPr>
           <w:rFonts w:ascii="Times New Roman" w:hAnsi="Times New Roman"/>
@@ -10145,6 +13521,92 @@
           <w:color w:val="1E1E1E"/>
           <w:sz w:val="20"/>
         </w:rPr>
+        <w:t xml:space="preserve">, and lowest MAE of </w:t>
+      </w:r>
+      <w:r>
+        <w:rPr>
+          <w:rFonts w:ascii="Times New Roman" w:hAnsi="Times New Roman"/>
+          <w:b/>
+          <w:i w:val="0"/>
+          <w:color w:val="1E1E1E"/>
+          <w:sz w:val="20"/>
+        </w:rPr>
+        <w:t>$0.2200$</w:t>
+      </w:r>
+      <w:r>
+        <w:rPr>
+          <w:rFonts w:ascii="Times New Roman" w:hAnsi="Times New Roman"/>
+          <w:b w:val="0"/>
+          <w:i w:val="0"/>
+          <w:color w:val="1E1E1E"/>
+          <w:sz w:val="20"/>
+        </w:rPr>
+        <w:t>, with post-hoc logit adjustment providing an effective test-time mechanism to balance accuracy against tail sensitivity.</w:t>
+      </w:r>
+    </w:p>
+    <w:p>
+      <w:pPr>
+        <w:spacing w:before="20" w:after="40" w:line="276" w:lineRule="auto"/>
+        <w:ind w:left="432"/>
+      </w:pPr>
+      <w:r>
+        <w:rPr>
+          <w:rFonts w:ascii="Times New Roman" w:hAnsi="Times New Roman"/>
+          <w:b/>
+          <w:sz w:val="20"/>
+        </w:rPr>
+        <w:t xml:space="preserve">4. </w:t>
+      </w:r>
+      <w:r>
+        <w:rPr>
+          <w:rFonts w:ascii="Times New Roman" w:hAnsi="Times New Roman"/>
+          <w:b/>
+          <w:i w:val="0"/>
+          <w:color w:val="1E1E1E"/>
+          <w:sz w:val="20"/>
+        </w:rPr>
+        <w:t>Loss-Level Inductive Bias Dominates Parameter Bloat:</w:t>
+      </w:r>
+      <w:r>
+        <w:rPr>
+          <w:rFonts w:ascii="Times New Roman" w:hAnsi="Times New Roman"/>
+          <w:b w:val="0"/>
+          <w:i w:val="0"/>
+          <w:color w:val="1E1E1E"/>
+          <w:sz w:val="20"/>
+        </w:rPr>
+        <w:t xml:space="preserve"> Enforcing conditional rank dependency, effective-number class weighting, soft-QWK loss regularization, and test-time augmentation achieved clinical-grade agreement on EfficientNet-B0 without resorting to parameter-heavy backbones that overfit scarce medical data.</w:t>
+      </w:r>
+    </w:p>
+    <w:p>
+      <w:pPr>
+        <w:spacing w:before="0" w:after="90" w:line="276" w:lineRule="auto"/>
+        <w:jc w:val="both"/>
+      </w:pPr>
+      <w:r>
+        <w:rPr>
+          <w:rFonts w:ascii="Times New Roman" w:hAnsi="Times New Roman"/>
+          <w:b w:val="0"/>
+          <w:i w:val="0"/>
+          <w:color w:val="1E1E1E"/>
+          <w:sz w:val="20"/>
+        </w:rPr>
+        <w:t>Future research will focus on combining conditional ordinal loss with vision-language explanation models [6] to provide interpretable natural-language rationales alongside calibrated stage predictions in prospective clinical screening trials.</w:t>
+      </w:r>
+    </w:p>
+    <w:p>
+      <w:pPr>
+        <w:spacing w:before="0" w:after="90" w:line="276" w:lineRule="auto"/>
+        <w:jc w:val="both"/>
+      </w:pPr>
+      <w:r>
+        <w:rPr>
+          <w:rFonts w:ascii="Times New Roman" w:hAnsi="Times New Roman"/>
+          <w:b w:val="0"/>
+          <w:i w:val="0"/>
+          <w:color w:val="1E1E1E"/>
+          <w:sz w:val="20"/>
+        </w:rPr>
         <w:t>---</w:t>
       </w:r>
     </w:p>
@@ -10409,6 +13871,22 @@
           <w:sz w:val="20"/>
         </w:rPr>
         <w:t>[14] Y. Cui, M. Jia, T.-Y. Lin, Y. Song, and S. Belongie, "Class-balanced loss based on effective number of samples," in Proc. IEEE Conf. Comput. Vis. Pattern Recognit. (CVPR), 2019, pp. 9268–9277.</w:t>
+      </w:r>
+    </w:p>
+    <w:p>
+      <w:pPr>
+        <w:spacing w:before="0" w:after="90" w:line="276" w:lineRule="auto"/>
+        <w:jc w:val="both"/>
+      </w:pPr>
+      <w:r>
+        <w:rPr>
+          <w:rFonts w:ascii="Times New Roman" w:hAnsi="Times New Roman"/>
+          <w:b w:val="0"/>
+          <w:i w:val="0"/>
+          <w:color w:val="1E1E1E"/>
+          <w:sz w:val="20"/>
+        </w:rPr>
+        <w:t>[15] A. K. Menon, S. Jayasumana, A. S. Rawat, H. Jain, A. Veit, and S. Kumar, "Long-tail learning via logit adjustment," in Proc. Int. Conf. Learn. Represent. (ICLR), 2021.</w:t>
       </w:r>
     </w:p>
     <w:p>

</xml_diff>